<commit_message>
Update completion docs for raylib version
</commit_message>
<xml_diff>
--- a/docs/贪吃蛇项目五人详细工作步骤安排.docx
+++ b/docs/贪吃蛇项目五人详细工作步骤安排.docx
@@ -4,7 +4,7 @@
   <w:body>
     <w:p>
       <w:pPr>
-        <w:spacing w:before="2000"/>
+        <w:spacing w:after="60"/>
         <w:jc w:val="center"/>
       </w:pPr>
       <w:r>
@@ -19,33 +19,47 @@
     </w:p>
     <w:p>
       <w:pPr>
-        <w:spacing w:before="200"/>
+        <w:spacing w:after="240"/>
         <w:jc w:val="center"/>
       </w:pPr>
       <w:r>
         <w:rPr>
           <w:rFonts w:ascii="微软雅黑" w:hAnsi="微软雅黑" w:eastAsia="微软雅黑"/>
+          <w:b w:val="0"/>
           <w:color w:val="4B5563"/>
           <w:sz w:val="24"/>
         </w:rPr>
-        <w:t>C 语言控制台贪吃蛇项目 · 小组协作版</w:t>
+        <w:t>C11 + raylib 图形化单机游戏 · 小组协作版</w:t>
       </w:r>
     </w:p>
     <w:p>
       <w:pPr>
-        <w:spacing w:before="400"/>
-        <w:jc w:val="center"/>
+        <w:spacing w:before="280" w:after="120"/>
       </w:pPr>
       <w:r>
         <w:rPr>
           <w:rFonts w:ascii="微软雅黑" w:hAnsi="微软雅黑" w:eastAsia="微软雅黑"/>
-          <w:color w:val="374151"/>
-          <w:sz w:val="22"/>
+          <w:b/>
+          <w:color w:val="2E74B5"/>
+          <w:sz w:val="32"/>
         </w:rPr>
-        <w:t>仓库地址：https://github.com/zhxymj/tanchishe</w:t>
+        <w:t>一、项目当前状态</w:t>
       </w:r>
     </w:p>
-    <w:p/>
+    <w:p>
+      <w:pPr>
+        <w:spacing w:line="300" w:lineRule="auto" w:after="120"/>
+      </w:pPr>
+      <w:r>
+        <w:rPr>
+          <w:rFonts w:ascii="微软雅黑" w:hAnsi="微软雅黑" w:eastAsia="微软雅黑"/>
+          <w:b w:val="0"/>
+          <w:color w:val="111827"/>
+          <w:sz w:val="21"/>
+        </w:rPr>
+        <w:t>本项目已经从控制台字符版调整为 C11 + raylib 图形化单机贪吃蛇。核心代码集中在 src/main.c，配套 build.bat、CMakeLists.txt 和 README.md。</w:t>
+      </w:r>
+    </w:p>
     <w:tbl>
       <w:tblPr>
         <w:tblStyle w:val="TableGrid"/>
@@ -54,53 +68,51 @@
         <w:tblLook w:firstColumn="1" w:firstRow="1" w:lastColumn="0" w:lastRow="0" w:noHBand="0" w:noVBand="1" w:val="04A0"/>
       </w:tblPr>
       <w:tblGrid>
-        <w:gridCol w:w="4929"/>
-        <w:gridCol w:w="4929"/>
+        <w:gridCol w:w="4986"/>
+        <w:gridCol w:w="4986"/>
       </w:tblGrid>
       <w:tr>
         <w:tc>
           <w:tcPr>
             <w:tcW w:type="dxa" w:w="1814"/>
             <w:vAlign w:val="center"/>
-            <w:shd w:fill="0F766E"/>
+            <w:shd w:fill="E8EEF5"/>
           </w:tcPr>
           <w:p>
             <w:pPr>
-              <w:spacing w:before="0" w:after="40" w:line="276" w:lineRule="auto"/>
+              <w:spacing w:after="40"/>
               <w:jc w:val="center"/>
             </w:pPr>
-            <w:r/>
             <w:r>
               <w:rPr>
                 <w:rFonts w:ascii="微软雅黑" w:hAnsi="微软雅黑" w:eastAsia="微软雅黑"/>
                 <w:b/>
-                <w:color w:val="FFFFFF"/>
+                <w:color w:val="1F4D78"/>
                 <w:sz w:val="19"/>
               </w:rPr>
-              <w:t>项目要求</w:t>
+              <w:t>检查项</w:t>
             </w:r>
           </w:p>
         </w:tc>
         <w:tc>
           <w:tcPr>
-            <w:tcW w:type="dxa" w:w="6520"/>
+            <w:tcW w:type="dxa" w:w="6690"/>
             <w:vAlign w:val="center"/>
-            <w:shd w:fill="0F766E"/>
+            <w:shd w:fill="E8EEF5"/>
           </w:tcPr>
           <w:p>
             <w:pPr>
-              <w:spacing w:before="0" w:after="40" w:line="276" w:lineRule="auto"/>
+              <w:spacing w:after="40"/>
               <w:jc w:val="center"/>
             </w:pPr>
-            <w:r/>
             <w:r>
               <w:rPr>
                 <w:rFonts w:ascii="微软雅黑" w:hAnsi="微软雅黑" w:eastAsia="微软雅黑"/>
                 <w:b/>
-                <w:color w:val="FFFFFF"/>
+                <w:color w:val="1F4D78"/>
                 <w:sz w:val="19"/>
               </w:rPr>
-              <w:t>说明</w:t>
+              <w:t>当前状态</w:t>
             </w:r>
           </w:p>
         </w:tc>
@@ -113,14 +125,13 @@
           </w:tcPr>
           <w:p>
             <w:pPr>
-              <w:spacing w:before="0" w:after="40" w:line="276" w:lineRule="auto"/>
-              <w:jc w:val="left"/>
+              <w:spacing w:after="40"/>
             </w:pPr>
-            <w:r/>
             <w:r>
               <w:rPr>
                 <w:rFonts w:ascii="微软雅黑" w:hAnsi="微软雅黑" w:eastAsia="微软雅黑"/>
                 <w:b w:val="0"/>
+                <w:color w:val="111827"/>
                 <w:sz w:val="18"/>
               </w:rPr>
               <w:t>实现语言</w:t>
@@ -129,22 +140,21 @@
         </w:tc>
         <w:tc>
           <w:tcPr>
-            <w:tcW w:type="dxa" w:w="6520"/>
+            <w:tcW w:type="dxa" w:w="6690"/>
             <w:vAlign w:val="center"/>
           </w:tcPr>
           <w:p>
             <w:pPr>
-              <w:spacing w:before="0" w:after="40" w:line="276" w:lineRule="auto"/>
-              <w:jc w:val="left"/>
+              <w:spacing w:after="40"/>
             </w:pPr>
-            <w:r/>
             <w:r>
               <w:rPr>
                 <w:rFonts w:ascii="微软雅黑" w:hAnsi="微软雅黑" w:eastAsia="微软雅黑"/>
                 <w:b w:val="0"/>
+                <w:color w:val="111827"/>
                 <w:sz w:val="18"/>
               </w:rPr>
-              <w:t>整体使用 C 语言，核心代码统一写在 .c 和 .h 文件中</w:t>
+              <w:t>C11</w:t>
             </w:r>
           </w:p>
         </w:tc>
@@ -157,38 +167,36 @@
           </w:tcPr>
           <w:p>
             <w:pPr>
-              <w:spacing w:before="0" w:after="40" w:line="276" w:lineRule="auto"/>
-              <w:jc w:val="left"/>
+              <w:spacing w:after="40"/>
             </w:pPr>
-            <w:r/>
             <w:r>
               <w:rPr>
                 <w:rFonts w:ascii="微软雅黑" w:hAnsi="微软雅黑" w:eastAsia="微软雅黑"/>
                 <w:b w:val="0"/>
+                <w:color w:val="111827"/>
                 <w:sz w:val="18"/>
               </w:rPr>
-              <w:t>协作方式</w:t>
+              <w:t>图形库</w:t>
             </w:r>
           </w:p>
         </w:tc>
         <w:tc>
           <w:tcPr>
-            <w:tcW w:type="dxa" w:w="6520"/>
+            <w:tcW w:type="dxa" w:w="6690"/>
             <w:vAlign w:val="center"/>
           </w:tcPr>
           <w:p>
             <w:pPr>
-              <w:spacing w:before="0" w:after="40" w:line="276" w:lineRule="auto"/>
-              <w:jc w:val="left"/>
+              <w:spacing w:after="40"/>
             </w:pPr>
-            <w:r/>
             <w:r>
               <w:rPr>
                 <w:rFonts w:ascii="微软雅黑" w:hAnsi="微软雅黑" w:eastAsia="微软雅黑"/>
                 <w:b w:val="0"/>
+                <w:color w:val="111827"/>
                 <w:sz w:val="18"/>
               </w:rPr>
-              <w:t>5 名成员分别负责 5 个模块，尽量只修改自己负责的文件</w:t>
+              <w:t>raylib 6.0，安装路径 D:\raylib</w:t>
             </w:r>
           </w:p>
         </w:tc>
@@ -201,38 +209,36 @@
           </w:tcPr>
           <w:p>
             <w:pPr>
-              <w:spacing w:before="0" w:after="40" w:line="276" w:lineRule="auto"/>
-              <w:jc w:val="left"/>
+              <w:spacing w:after="40"/>
             </w:pPr>
-            <w:r/>
             <w:r>
               <w:rPr>
                 <w:rFonts w:ascii="微软雅黑" w:hAnsi="微软雅黑" w:eastAsia="微软雅黑"/>
                 <w:b w:val="0"/>
+                <w:color w:val="111827"/>
                 <w:sz w:val="18"/>
               </w:rPr>
-              <w:t>提交要求</w:t>
+              <w:t>游戏类型</w:t>
             </w:r>
           </w:p>
         </w:tc>
         <w:tc>
           <w:tcPr>
-            <w:tcW w:type="dxa" w:w="6520"/>
+            <w:tcW w:type="dxa" w:w="6690"/>
             <w:vAlign w:val="center"/>
           </w:tcPr>
           <w:p>
             <w:pPr>
-              <w:spacing w:before="0" w:after="40" w:line="276" w:lineRule="auto"/>
-              <w:jc w:val="left"/>
+              <w:spacing w:after="40"/>
             </w:pPr>
-            <w:r/>
             <w:r>
               <w:rPr>
                 <w:rFonts w:ascii="微软雅黑" w:hAnsi="微软雅黑" w:eastAsia="微软雅黑"/>
                 <w:b w:val="0"/>
+                <w:color w:val="111827"/>
                 <w:sz w:val="18"/>
               </w:rPr>
-              <w:t>提交前先同步最新代码、编译通过后再提交、只提交本人负责文件</w:t>
+              <w:t>电脑键盘控制的窗口化单机游戏</w:t>
             </w:r>
           </w:p>
         </w:tc>
@@ -245,38 +251,78 @@
           </w:tcPr>
           <w:p>
             <w:pPr>
-              <w:spacing w:before="0" w:after="40" w:line="276" w:lineRule="auto"/>
-              <w:jc w:val="left"/>
+              <w:spacing w:after="40"/>
             </w:pPr>
-            <w:r/>
             <w:r>
               <w:rPr>
                 <w:rFonts w:ascii="微软雅黑" w:hAnsi="微软雅黑" w:eastAsia="微软雅黑"/>
                 <w:b w:val="0"/>
+                <w:color w:val="111827"/>
                 <w:sz w:val="18"/>
               </w:rPr>
-              <w:t>文档用途</w:t>
+              <w:t>编译方式</w:t>
             </w:r>
           </w:p>
         </w:tc>
         <w:tc>
           <w:tcPr>
-            <w:tcW w:type="dxa" w:w="6520"/>
+            <w:tcW w:type="dxa" w:w="6690"/>
             <w:vAlign w:val="center"/>
           </w:tcPr>
           <w:p>
             <w:pPr>
-              <w:spacing w:before="0" w:after="40" w:line="276" w:lineRule="auto"/>
-              <w:jc w:val="left"/>
+              <w:spacing w:after="40"/>
             </w:pPr>
-            <w:r/>
             <w:r>
               <w:rPr>
                 <w:rFonts w:ascii="微软雅黑" w:hAnsi="微软雅黑" w:eastAsia="微软雅黑"/>
                 <w:b w:val="0"/>
+                <w:color w:val="111827"/>
                 <w:sz w:val="18"/>
               </w:rPr>
-              <w:t>发给组员作为开发步骤和提交代码参考</w:t>
+              <w:t>build.bat、gcc 命令、CMake（英文路径更稳定）</w:t>
+            </w:r>
+          </w:p>
+        </w:tc>
+      </w:tr>
+      <w:tr>
+        <w:tc>
+          <w:tcPr>
+            <w:tcW w:type="dxa" w:w="1814"/>
+            <w:vAlign w:val="center"/>
+          </w:tcPr>
+          <w:p>
+            <w:pPr>
+              <w:spacing w:after="40"/>
+            </w:pPr>
+            <w:r>
+              <w:rPr>
+                <w:rFonts w:ascii="微软雅黑" w:hAnsi="微软雅黑" w:eastAsia="微软雅黑"/>
+                <w:b w:val="0"/>
+                <w:color w:val="111827"/>
+                <w:sz w:val="18"/>
+              </w:rPr>
+              <w:t>仓库地址</w:t>
+            </w:r>
+          </w:p>
+        </w:tc>
+        <w:tc>
+          <w:tcPr>
+            <w:tcW w:type="dxa" w:w="6690"/>
+            <w:vAlign w:val="center"/>
+          </w:tcPr>
+          <w:p>
+            <w:pPr>
+              <w:spacing w:after="40"/>
+            </w:pPr>
+            <w:r>
+              <w:rPr>
+                <w:rFonts w:ascii="微软雅黑" w:hAnsi="微软雅黑" w:eastAsia="微软雅黑"/>
+                <w:b w:val="0"/>
+                <w:color w:val="111827"/>
+                <w:sz w:val="18"/>
+              </w:rPr>
+              <w:t>https://github.com/zhxymj/tanchishe</w:t>
             </w:r>
           </w:p>
         </w:tc>
@@ -284,62 +330,31 @@
     </w:tbl>
     <w:p/>
     <w:p>
-      <w:r>
-        <w:br w:type="page"/>
-      </w:r>
-    </w:p>
-    <w:p>
       <w:pPr>
-        <w:pStyle w:val="Heading1"/>
-        <w:spacing w:before="160" w:after="100"/>
+        <w:spacing w:before="280" w:after="120"/>
       </w:pPr>
       <w:r>
         <w:rPr>
           <w:rFonts w:ascii="微软雅黑" w:hAnsi="微软雅黑" w:eastAsia="微软雅黑"/>
           <w:b/>
-          <w:color w:val="0F766E"/>
+          <w:color w:val="2E74B5"/>
           <w:sz w:val="32"/>
         </w:rPr>
-        <w:t>一、全体成员统一要求</w:t>
+        <w:t>二、统一开发流程</w:t>
       </w:r>
     </w:p>
     <w:p>
       <w:pPr>
-        <w:spacing w:line="300" w:lineRule="auto" w:after="60"/>
-        <w:ind w:firstLine="420"/>
+        <w:spacing w:line="300" w:lineRule="auto" w:after="120"/>
       </w:pPr>
       <w:r>
         <w:rPr>
           <w:rFonts w:ascii="微软雅黑" w:hAnsi="微软雅黑" w:eastAsia="微软雅黑"/>
+          <w:b w:val="0"/>
+          <w:color w:val="111827"/>
+          <w:sz w:val="21"/>
         </w:rPr>
-        <w:t>本项目采用模块化分工，每个成员负责独立的 .c/.h 文件。开发时不要把所有代码都写进 main.c，也不要随意修改其他成员负责的文件。</w:t>
-      </w:r>
-    </w:p>
-    <w:p>
-      <w:pPr>
-        <w:spacing w:line="300" w:lineRule="auto" w:after="60"/>
-        <w:ind w:firstLine="420"/>
-      </w:pPr>
-      <w:r>
-        <w:rPr>
-          <w:rFonts w:ascii="微软雅黑" w:hAnsi="微软雅黑" w:eastAsia="微软雅黑"/>
-        </w:rPr>
-        <w:t>每次写代码前先同步 GitHub 上的最新版本，写完后先编译，确认没有错误再提交。</w:t>
-      </w:r>
-    </w:p>
-    <w:p>
-      <w:pPr>
-        <w:pStyle w:val="Heading2"/>
-        <w:spacing w:before="100" w:after="100"/>
-      </w:pPr>
-      <w:r>
-        <w:rPr>
-          <w:rFonts w:ascii="微软雅黑" w:hAnsi="微软雅黑" w:eastAsia="微软雅黑"/>
-          <w:b/>
-          <w:color w:val="374151"/>
-          <w:sz w:val="25"/>
-        </w:rPr>
-        <w:t>1. 每次写代码前先同步</w:t>
+        <w:t>每次写代码前先同步，写完后先编译，再提交。由于 src/main.c 是单文件实现，成员之间要按函数区域协作。</w:t>
       </w:r>
     </w:p>
     <w:tbl>
@@ -350,26 +365,26 @@
         <w:tblLook w:firstColumn="1" w:firstRow="1" w:lastColumn="0" w:lastRow="0" w:noHBand="0" w:noVBand="1" w:val="04A0"/>
       </w:tblPr>
       <w:tblGrid>
-        <w:gridCol w:w="9858"/>
+        <w:gridCol w:w="9972"/>
       </w:tblGrid>
       <w:tr>
         <w:tc>
           <w:tcPr>
-            <w:tcW w:type="dxa" w:w="9858"/>
+            <w:tcW w:type="dxa" w:w="9972"/>
             <w:shd w:fill="F3F4F6"/>
-            <w:vAlign w:val="center"/>
           </w:tcPr>
           <w:p>
             <w:pPr>
-              <w:spacing w:before="40" w:after="40"/>
+              <w:spacing w:before="60" w:after="60"/>
             </w:pPr>
             <w:r>
               <w:rPr>
                 <w:rFonts w:ascii="Consolas" w:hAnsi="Consolas" w:eastAsia="Consolas"/>
+                <w:b w:val="0"/>
                 <w:color w:val="111827"/>
                 <w:sz w:val="18"/>
               </w:rPr>
-              <w:t>cd tanchishe</w:t>
+              <w:t>git pull origin main</w:t>
             </w:r>
             <w:r>
               <w:br/>
@@ -377,10 +392,11 @@
             <w:r>
               <w:rPr>
                 <w:rFonts w:ascii="Consolas" w:hAnsi="Consolas" w:eastAsia="Consolas"/>
+                <w:b w:val="0"/>
                 <w:color w:val="111827"/>
                 <w:sz w:val="18"/>
               </w:rPr>
-              <w:t>git status</w:t>
+              <w:t>.\build.bat</w:t>
             </w:r>
             <w:r>
               <w:br/>
@@ -388,160 +404,11 @@
             <w:r>
               <w:rPr>
                 <w:rFonts w:ascii="Consolas" w:hAnsi="Consolas" w:eastAsia="Consolas"/>
+                <w:b w:val="0"/>
                 <w:color w:val="111827"/>
                 <w:sz w:val="18"/>
               </w:rPr>
-              <w:t>git pull origin main</w:t>
-            </w:r>
-          </w:p>
-        </w:tc>
-      </w:tr>
-    </w:tbl>
-    <w:p/>
-    <w:p>
-      <w:pPr>
-        <w:spacing w:line="288" w:lineRule="auto" w:after="40"/>
-        <w:ind w:left="369" w:hanging="198"/>
-      </w:pPr>
-      <w:r>
-        <w:rPr>
-          <w:rFonts w:ascii="微软雅黑" w:hAnsi="微软雅黑" w:eastAsia="微软雅黑"/>
-          <w:sz w:val="21"/>
-        </w:rPr>
-        <w:t>• 如果 git status 显示 working tree clean，说明当前没有未提交修改，可以直接 pull。</w:t>
-      </w:r>
-    </w:p>
-    <w:p>
-      <w:pPr>
-        <w:spacing w:line="288" w:lineRule="auto" w:after="40"/>
-        <w:ind w:left="369" w:hanging="198"/>
-      </w:pPr>
-      <w:r>
-        <w:rPr>
-          <w:rFonts w:ascii="微软雅黑" w:hAnsi="微软雅黑" w:eastAsia="微软雅黑"/>
-          <w:sz w:val="21"/>
-        </w:rPr>
-        <w:t>• 如果已经改了代码但没提交，优先先 commit，再 pull；或者用 git stash 临时保存。</w:t>
-      </w:r>
-    </w:p>
-    <w:p>
-      <w:pPr>
-        <w:pStyle w:val="Heading2"/>
-        <w:spacing w:before="100" w:after="100"/>
-      </w:pPr>
-      <w:r>
-        <w:rPr>
-          <w:rFonts w:ascii="微软雅黑" w:hAnsi="微软雅黑" w:eastAsia="微软雅黑"/>
-          <w:b/>
-          <w:color w:val="374151"/>
-          <w:sz w:val="25"/>
-        </w:rPr>
-        <w:t>2. 提交前必须编译</w:t>
-      </w:r>
-    </w:p>
-    <w:tbl>
-      <w:tblPr>
-        <w:tblStyle w:val="TableGrid"/>
-        <w:tblW w:type="auto" w:w="0"/>
-        <w:jc w:val="center"/>
-        <w:tblLook w:firstColumn="1" w:firstRow="1" w:lastColumn="0" w:lastRow="0" w:noHBand="0" w:noVBand="1" w:val="04A0"/>
-      </w:tblPr>
-      <w:tblGrid>
-        <w:gridCol w:w="9858"/>
-      </w:tblGrid>
-      <w:tr>
-        <w:tc>
-          <w:tcPr>
-            <w:tcW w:type="dxa" w:w="9858"/>
-            <w:shd w:fill="F3F4F6"/>
-            <w:vAlign w:val="center"/>
-          </w:tcPr>
-          <w:p>
-            <w:pPr>
-              <w:spacing w:before="40" w:after="40"/>
-            </w:pPr>
-            <w:r>
-              <w:rPr>
-                <w:rFonts w:ascii="Consolas" w:hAnsi="Consolas" w:eastAsia="Consolas"/>
-                <w:color w:val="111827"/>
-                <w:sz w:val="18"/>
-              </w:rPr>
-              <w:t>gcc src\main.c src\game.c src\snake.c src\food.c src\collision.c src\ui.c -o snake.exe</w:t>
-            </w:r>
-          </w:p>
-        </w:tc>
-      </w:tr>
-    </w:tbl>
-    <w:p/>
-    <w:p>
-      <w:pPr>
-        <w:spacing w:line="288" w:lineRule="auto" w:after="40"/>
-        <w:ind w:left="369" w:hanging="198"/>
-      </w:pPr>
-      <w:r>
-        <w:rPr>
-          <w:rFonts w:ascii="微软雅黑" w:hAnsi="微软雅黑" w:eastAsia="微软雅黑"/>
-          <w:sz w:val="21"/>
-        </w:rPr>
-        <w:t>• 编译成功后再提交。</w:t>
-      </w:r>
-    </w:p>
-    <w:p>
-      <w:pPr>
-        <w:spacing w:line="288" w:lineRule="auto" w:after="40"/>
-        <w:ind w:left="369" w:hanging="198"/>
-      </w:pPr>
-      <w:r>
-        <w:rPr>
-          <w:rFonts w:ascii="微软雅黑" w:hAnsi="微软雅黑" w:eastAsia="微软雅黑"/>
-          <w:sz w:val="21"/>
-        </w:rPr>
-        <w:t>• snake.exe 是编译产物，不需要提交。</w:t>
-      </w:r>
-    </w:p>
-    <w:p>
-      <w:pPr>
-        <w:pStyle w:val="Heading2"/>
-        <w:spacing w:before="100" w:after="100"/>
-      </w:pPr>
-      <w:r>
-        <w:rPr>
-          <w:rFonts w:ascii="微软雅黑" w:hAnsi="微软雅黑" w:eastAsia="微软雅黑"/>
-          <w:b/>
-          <w:color w:val="374151"/>
-          <w:sz w:val="25"/>
-        </w:rPr>
-        <w:t>3. 提交代码的标准流程</w:t>
-      </w:r>
-    </w:p>
-    <w:tbl>
-      <w:tblPr>
-        <w:tblStyle w:val="TableGrid"/>
-        <w:tblW w:type="auto" w:w="0"/>
-        <w:jc w:val="center"/>
-        <w:tblLook w:firstColumn="1" w:firstRow="1" w:lastColumn="0" w:lastRow="0" w:noHBand="0" w:noVBand="1" w:val="04A0"/>
-      </w:tblPr>
-      <w:tblGrid>
-        <w:gridCol w:w="9858"/>
-      </w:tblGrid>
-      <w:tr>
-        <w:tc>
-          <w:tcPr>
-            <w:tcW w:type="dxa" w:w="9858"/>
-            <w:shd w:fill="F3F4F6"/>
-            <w:vAlign w:val="center"/>
-          </w:tcPr>
-          <w:p>
-            <w:pPr>
-              <w:spacing w:before="40" w:after="40"/>
-            </w:pPr>
-            <w:r>
-              <w:rPr>
-                <w:rFonts w:ascii="Consolas" w:hAnsi="Consolas" w:eastAsia="Consolas"/>
-                <w:color w:val="111827"/>
-                <w:sz w:val="18"/>
-              </w:rPr>
-              <w:t>git status</w:t>
+              <w:t>git diff src\main.c</w:t>
             </w:r>
             <w:r>
               <w:br/>
@@ -549,10 +416,11 @@
             <w:r>
               <w:rPr>
                 <w:rFonts w:ascii="Consolas" w:hAnsi="Consolas" w:eastAsia="Consolas"/>
+                <w:b w:val="0"/>
                 <w:color w:val="111827"/>
                 <w:sz w:val="18"/>
               </w:rPr>
-              <w:t>git add src\自己负责的文件.c src\自己负责的文件.h</w:t>
+              <w:t>git add src\main.c</w:t>
             </w:r>
             <w:r>
               <w:br/>
@@ -560,10 +428,11 @@
             <w:r>
               <w:rPr>
                 <w:rFonts w:ascii="Consolas" w:hAnsi="Consolas" w:eastAsia="Consolas"/>
+                <w:b w:val="0"/>
                 <w:color w:val="111827"/>
                 <w:sz w:val="18"/>
               </w:rPr>
-              <w:t>git commit -m "完成某某模块"</w:t>
+              <w:t>git commit -m "说明本次完成的功能"</w:t>
             </w:r>
             <w:r>
               <w:br/>
@@ -571,6 +440,7 @@
             <w:r>
               <w:rPr>
                 <w:rFonts w:ascii="Consolas" w:hAnsi="Consolas" w:eastAsia="Consolas"/>
+                <w:b w:val="0"/>
                 <w:color w:val="111827"/>
                 <w:sz w:val="18"/>
               </w:rPr>
@@ -583,43 +453,16 @@
     <w:p/>
     <w:p>
       <w:pPr>
-        <w:spacing w:line="288" w:lineRule="auto" w:after="40"/>
-        <w:ind w:left="369" w:hanging="198"/>
-      </w:pPr>
-      <w:r>
-        <w:rPr>
-          <w:rFonts w:ascii="微软雅黑" w:hAnsi="微软雅黑" w:eastAsia="微软雅黑"/>
-          <w:sz w:val="21"/>
-        </w:rPr>
-        <w:t>• 不要习惯性使用 git add .，避免把无关文件或别人文件一起提交。</w:t>
-      </w:r>
-    </w:p>
-    <w:p>
-      <w:pPr>
-        <w:spacing w:line="288" w:lineRule="auto" w:after="40"/>
-        <w:ind w:left="369" w:hanging="198"/>
-      </w:pPr>
-      <w:r>
-        <w:rPr>
-          <w:rFonts w:ascii="微软雅黑" w:hAnsi="微软雅黑" w:eastAsia="微软雅黑"/>
-          <w:sz w:val="21"/>
-        </w:rPr>
-        <w:t>• push 成功后打开 GitHub 仓库刷新，确认自己的提交已经出现。</w:t>
-      </w:r>
-    </w:p>
-    <w:p>
-      <w:pPr>
-        <w:pStyle w:val="Heading2"/>
-        <w:spacing w:before="100" w:after="100"/>
+        <w:spacing w:before="180" w:after="80"/>
       </w:pPr>
       <w:r>
         <w:rPr>
           <w:rFonts w:ascii="微软雅黑" w:hAnsi="微软雅黑" w:eastAsia="微软雅黑"/>
           <w:b/>
-          <w:color w:val="374151"/>
-          <w:sz w:val="25"/>
+          <w:color w:val="1F4D78"/>
+          <w:sz w:val="26"/>
         </w:rPr>
-        <w:t>4. 五人模块总览</w:t>
+        <w:t>三、成员1：主程序框架与状态管理</w:t>
       </w:r>
     </w:p>
     <w:tbl>
@@ -630,77 +473,51 @@
         <w:tblLook w:firstColumn="1" w:firstRow="1" w:lastColumn="0" w:lastRow="0" w:noHBand="0" w:noVBand="1" w:val="04A0"/>
       </w:tblPr>
       <w:tblGrid>
-        <w:gridCol w:w="3286"/>
-        <w:gridCol w:w="3286"/>
-        <w:gridCol w:w="3286"/>
+        <w:gridCol w:w="4986"/>
+        <w:gridCol w:w="4986"/>
       </w:tblGrid>
       <w:tr>
         <w:tc>
           <w:tcPr>
-            <w:tcW w:type="dxa" w:w="1134"/>
+            <w:tcW w:type="dxa" w:w="1701"/>
             <w:vAlign w:val="center"/>
-            <w:shd w:fill="0F766E"/>
+            <w:shd w:fill="E8EEF5"/>
           </w:tcPr>
           <w:p>
             <w:pPr>
-              <w:spacing w:before="0" w:after="40" w:line="276" w:lineRule="auto"/>
+              <w:spacing w:after="40"/>
               <w:jc w:val="center"/>
             </w:pPr>
-            <w:r/>
             <w:r>
               <w:rPr>
                 <w:rFonts w:ascii="微软雅黑" w:hAnsi="微软雅黑" w:eastAsia="微软雅黑"/>
                 <w:b/>
-                <w:color w:val="FFFFFF"/>
+                <w:color w:val="1F4D78"/>
                 <w:sz w:val="19"/>
               </w:rPr>
-              <w:t>成员</w:t>
+              <w:t>项目</w:t>
             </w:r>
           </w:p>
         </w:tc>
         <w:tc>
           <w:tcPr>
-            <w:tcW w:type="dxa" w:w="2268"/>
+            <w:tcW w:type="dxa" w:w="6803"/>
             <w:vAlign w:val="center"/>
-            <w:shd w:fill="0F766E"/>
+            <w:shd w:fill="E8EEF5"/>
           </w:tcPr>
           <w:p>
             <w:pPr>
-              <w:spacing w:before="0" w:after="40" w:line="276" w:lineRule="auto"/>
+              <w:spacing w:after="40"/>
               <w:jc w:val="center"/>
             </w:pPr>
-            <w:r/>
             <w:r>
               <w:rPr>
                 <w:rFonts w:ascii="微软雅黑" w:hAnsi="微软雅黑" w:eastAsia="微软雅黑"/>
                 <w:b/>
-                <w:color w:val="FFFFFF"/>
+                <w:color w:val="1F4D78"/>
                 <w:sz w:val="19"/>
               </w:rPr>
-              <w:t>负责文件</w:t>
-            </w:r>
-          </w:p>
-        </w:tc>
-        <w:tc>
-          <w:tcPr>
-            <w:tcW w:type="dxa" w:w="4762"/>
-            <w:vAlign w:val="center"/>
-            <w:shd w:fill="0F766E"/>
-          </w:tcPr>
-          <w:p>
-            <w:pPr>
-              <w:spacing w:before="0" w:after="40" w:line="276" w:lineRule="auto"/>
-              <w:jc w:val="center"/>
-            </w:pPr>
-            <w:r/>
-            <w:r>
-              <w:rPr>
-                <w:rFonts w:ascii="微软雅黑" w:hAnsi="微软雅黑" w:eastAsia="微软雅黑"/>
-                <w:b/>
-                <w:color w:val="FFFFFF"/>
-                <w:sz w:val="19"/>
-              </w:rPr>
-              <w:t>主要工作</w:t>
+              <w:t>内容</w:t>
             </w:r>
           </w:p>
         </w:tc>
@@ -708,68 +525,41 @@
       <w:tr>
         <w:tc>
           <w:tcPr>
-            <w:tcW w:type="dxa" w:w="1134"/>
+            <w:tcW w:type="dxa" w:w="1701"/>
             <w:vAlign w:val="center"/>
           </w:tcPr>
           <w:p>
             <w:pPr>
-              <w:spacing w:before="0" w:after="40" w:line="276" w:lineRule="auto"/>
-              <w:jc w:val="left"/>
+              <w:spacing w:after="40"/>
             </w:pPr>
-            <w:r/>
             <w:r>
               <w:rPr>
                 <w:rFonts w:ascii="微软雅黑" w:hAnsi="微软雅黑" w:eastAsia="微软雅黑"/>
                 <w:b w:val="0"/>
+                <w:color w:val="111827"/>
                 <w:sz w:val="18"/>
               </w:rPr>
-              <w:t>成员1</w:t>
+              <w:t>责任范围</w:t>
             </w:r>
           </w:p>
         </w:tc>
         <w:tc>
           <w:tcPr>
-            <w:tcW w:type="dxa" w:w="2268"/>
+            <w:tcW w:type="dxa" w:w="6803"/>
             <w:vAlign w:val="center"/>
           </w:tcPr>
           <w:p>
             <w:pPr>
-              <w:spacing w:before="0" w:after="40" w:line="276" w:lineRule="auto"/>
-              <w:jc w:val="left"/>
+              <w:spacing w:after="40"/>
             </w:pPr>
-            <w:r/>
             <w:r>
               <w:rPr>
                 <w:rFonts w:ascii="微软雅黑" w:hAnsi="微软雅黑" w:eastAsia="微软雅黑"/>
                 <w:b w:val="0"/>
+                <w:color w:val="111827"/>
                 <w:sz w:val="18"/>
               </w:rPr>
-              <w:t>src/main.c</w:t>
-              <w:br/>
-              <w:t>src/game.c</w:t>
-              <w:br/>
-              <w:t>src/game.h</w:t>
-            </w:r>
-          </w:p>
-        </w:tc>
-        <w:tc>
-          <w:tcPr>
-            <w:tcW w:type="dxa" w:w="4762"/>
-            <w:vAlign w:val="center"/>
-          </w:tcPr>
-          <w:p>
-            <w:pPr>
-              <w:spacing w:before="0" w:after="40" w:line="276" w:lineRule="auto"/>
-              <w:jc w:val="left"/>
-            </w:pPr>
-            <w:r/>
-            <w:r>
-              <w:rPr>
-                <w:rFonts w:ascii="微软雅黑" w:hAnsi="微软雅黑" w:eastAsia="微软雅黑"/>
-                <w:b w:val="0"/>
-                <w:sz w:val="18"/>
-              </w:rPr>
-              <w:t>主程序、初始化、主循环、状态切换、暂停、重开、退出和模块整合</w:t>
+              <w:t>窗口初始化、游戏初始化、状态切换、暂停继续、重开和固定时间步进。</w:t>
             </w:r>
           </w:p>
         </w:tc>
@@ -777,267 +567,41 @@
       <w:tr>
         <w:tc>
           <w:tcPr>
-            <w:tcW w:type="dxa" w:w="1134"/>
+            <w:tcW w:type="dxa" w:w="1701"/>
             <w:vAlign w:val="center"/>
           </w:tcPr>
           <w:p>
             <w:pPr>
-              <w:spacing w:before="0" w:after="40" w:line="276" w:lineRule="auto"/>
-              <w:jc w:val="left"/>
+              <w:spacing w:after="40"/>
             </w:pPr>
-            <w:r/>
             <w:r>
               <w:rPr>
                 <w:rFonts w:ascii="微软雅黑" w:hAnsi="微软雅黑" w:eastAsia="微软雅黑"/>
                 <w:b w:val="0"/>
+                <w:color w:val="111827"/>
                 <w:sz w:val="18"/>
               </w:rPr>
-              <w:t>成员2</w:t>
+              <w:t>主要函数</w:t>
             </w:r>
           </w:p>
         </w:tc>
         <w:tc>
           <w:tcPr>
-            <w:tcW w:type="dxa" w:w="2268"/>
+            <w:tcW w:type="dxa" w:w="6803"/>
             <w:vAlign w:val="center"/>
           </w:tcPr>
           <w:p>
             <w:pPr>
-              <w:spacing w:before="0" w:after="40" w:line="276" w:lineRule="auto"/>
-              <w:jc w:val="left"/>
+              <w:spacing w:after="40"/>
             </w:pPr>
-            <w:r/>
             <w:r>
               <w:rPr>
                 <w:rFonts w:ascii="微软雅黑" w:hAnsi="微软雅黑" w:eastAsia="微软雅黑"/>
                 <w:b w:val="0"/>
+                <w:color w:val="111827"/>
                 <w:sz w:val="18"/>
               </w:rPr>
-              <w:t>src/snake.c</w:t>
-              <w:br/>
-              <w:t>src/snake.h</w:t>
-            </w:r>
-          </w:p>
-        </w:tc>
-        <w:tc>
-          <w:tcPr>
-            <w:tcW w:type="dxa" w:w="4762"/>
-            <w:vAlign w:val="center"/>
-          </w:tcPr>
-          <w:p>
-            <w:pPr>
-              <w:spacing w:before="0" w:after="40" w:line="276" w:lineRule="auto"/>
-              <w:jc w:val="left"/>
-            </w:pPr>
-            <w:r/>
-            <w:r>
-              <w:rPr>
-                <w:rFonts w:ascii="微软雅黑" w:hAnsi="微软雅黑" w:eastAsia="微软雅黑"/>
-                <w:b w:val="0"/>
-                <w:sz w:val="18"/>
-              </w:rPr>
-              <w:t>蛇身坐标、方向控制、蛇头移动、蛇身跟随和增长</w:t>
-            </w:r>
-          </w:p>
-        </w:tc>
-      </w:tr>
-      <w:tr>
-        <w:tc>
-          <w:tcPr>
-            <w:tcW w:type="dxa" w:w="1134"/>
-            <w:vAlign w:val="center"/>
-          </w:tcPr>
-          <w:p>
-            <w:pPr>
-              <w:spacing w:before="0" w:after="40" w:line="276" w:lineRule="auto"/>
-              <w:jc w:val="left"/>
-            </w:pPr>
-            <w:r/>
-            <w:r>
-              <w:rPr>
-                <w:rFonts w:ascii="微软雅黑" w:hAnsi="微软雅黑" w:eastAsia="微软雅黑"/>
-                <w:b w:val="0"/>
-                <w:sz w:val="18"/>
-              </w:rPr>
-              <w:t>成员3</w:t>
-            </w:r>
-          </w:p>
-        </w:tc>
-        <w:tc>
-          <w:tcPr>
-            <w:tcW w:type="dxa" w:w="2268"/>
-            <w:vAlign w:val="center"/>
-          </w:tcPr>
-          <w:p>
-            <w:pPr>
-              <w:spacing w:before="0" w:after="40" w:line="276" w:lineRule="auto"/>
-              <w:jc w:val="left"/>
-            </w:pPr>
-            <w:r/>
-            <w:r>
-              <w:rPr>
-                <w:rFonts w:ascii="微软雅黑" w:hAnsi="微软雅黑" w:eastAsia="微软雅黑"/>
-                <w:b w:val="0"/>
-                <w:sz w:val="18"/>
-              </w:rPr>
-              <w:t>src/food.c</w:t>
-              <w:br/>
-              <w:t>src/food.h</w:t>
-            </w:r>
-          </w:p>
-        </w:tc>
-        <w:tc>
-          <w:tcPr>
-            <w:tcW w:type="dxa" w:w="4762"/>
-            <w:vAlign w:val="center"/>
-          </w:tcPr>
-          <w:p>
-            <w:pPr>
-              <w:spacing w:before="0" w:after="40" w:line="276" w:lineRule="auto"/>
-              <w:jc w:val="left"/>
-            </w:pPr>
-            <w:r/>
-            <w:r>
-              <w:rPr>
-                <w:rFonts w:ascii="微软雅黑" w:hAnsi="微软雅黑" w:eastAsia="微软雅黑"/>
-                <w:b w:val="0"/>
-                <w:sz w:val="18"/>
-              </w:rPr>
-              <w:t>食物随机生成、避免重合、得分、等级和速度变化</w:t>
-            </w:r>
-          </w:p>
-        </w:tc>
-      </w:tr>
-      <w:tr>
-        <w:tc>
-          <w:tcPr>
-            <w:tcW w:type="dxa" w:w="1134"/>
-            <w:vAlign w:val="center"/>
-          </w:tcPr>
-          <w:p>
-            <w:pPr>
-              <w:spacing w:before="0" w:after="40" w:line="276" w:lineRule="auto"/>
-              <w:jc w:val="left"/>
-            </w:pPr>
-            <w:r/>
-            <w:r>
-              <w:rPr>
-                <w:rFonts w:ascii="微软雅黑" w:hAnsi="微软雅黑" w:eastAsia="微软雅黑"/>
-                <w:b w:val="0"/>
-                <w:sz w:val="18"/>
-              </w:rPr>
-              <w:t>成员4</w:t>
-            </w:r>
-          </w:p>
-        </w:tc>
-        <w:tc>
-          <w:tcPr>
-            <w:tcW w:type="dxa" w:w="2268"/>
-            <w:vAlign w:val="center"/>
-          </w:tcPr>
-          <w:p>
-            <w:pPr>
-              <w:spacing w:before="0" w:after="40" w:line="276" w:lineRule="auto"/>
-              <w:jc w:val="left"/>
-            </w:pPr>
-            <w:r/>
-            <w:r>
-              <w:rPr>
-                <w:rFonts w:ascii="微软雅黑" w:hAnsi="微软雅黑" w:eastAsia="微软雅黑"/>
-                <w:b w:val="0"/>
-                <w:sz w:val="18"/>
-              </w:rPr>
-              <w:t>src/collision.c</w:t>
-              <w:br/>
-              <w:t>src/collision.h</w:t>
-            </w:r>
-          </w:p>
-        </w:tc>
-        <w:tc>
-          <w:tcPr>
-            <w:tcW w:type="dxa" w:w="4762"/>
-            <w:vAlign w:val="center"/>
-          </w:tcPr>
-          <w:p>
-            <w:pPr>
-              <w:spacing w:before="0" w:after="40" w:line="276" w:lineRule="auto"/>
-              <w:jc w:val="left"/>
-            </w:pPr>
-            <w:r/>
-            <w:r>
-              <w:rPr>
-                <w:rFonts w:ascii="微软雅黑" w:hAnsi="微软雅黑" w:eastAsia="微软雅黑"/>
-                <w:b w:val="0"/>
-                <w:sz w:val="18"/>
-              </w:rPr>
-              <w:t>撞墙、撞自身、失败判断和胜利判断</w:t>
-            </w:r>
-          </w:p>
-        </w:tc>
-      </w:tr>
-      <w:tr>
-        <w:tc>
-          <w:tcPr>
-            <w:tcW w:type="dxa" w:w="1134"/>
-            <w:vAlign w:val="center"/>
-          </w:tcPr>
-          <w:p>
-            <w:pPr>
-              <w:spacing w:before="0" w:after="40" w:line="276" w:lineRule="auto"/>
-              <w:jc w:val="left"/>
-            </w:pPr>
-            <w:r/>
-            <w:r>
-              <w:rPr>
-                <w:rFonts w:ascii="微软雅黑" w:hAnsi="微软雅黑" w:eastAsia="微软雅黑"/>
-                <w:b w:val="0"/>
-                <w:sz w:val="18"/>
-              </w:rPr>
-              <w:t>成员5</w:t>
-            </w:r>
-          </w:p>
-        </w:tc>
-        <w:tc>
-          <w:tcPr>
-            <w:tcW w:type="dxa" w:w="2268"/>
-            <w:vAlign w:val="center"/>
-          </w:tcPr>
-          <w:p>
-            <w:pPr>
-              <w:spacing w:before="0" w:after="40" w:line="276" w:lineRule="auto"/>
-              <w:jc w:val="left"/>
-            </w:pPr>
-            <w:r/>
-            <w:r>
-              <w:rPr>
-                <w:rFonts w:ascii="微软雅黑" w:hAnsi="微软雅黑" w:eastAsia="微软雅黑"/>
-                <w:b w:val="0"/>
-                <w:sz w:val="18"/>
-              </w:rPr>
-              <w:t>src/ui.c</w:t>
-              <w:br/>
-              <w:t>src/ui.h</w:t>
-            </w:r>
-          </w:p>
-        </w:tc>
-        <w:tc>
-          <w:tcPr>
-            <w:tcW w:type="dxa" w:w="4762"/>
-            <w:vAlign w:val="center"/>
-          </w:tcPr>
-          <w:p>
-            <w:pPr>
-              <w:spacing w:before="0" w:after="40" w:line="276" w:lineRule="auto"/>
-              <w:jc w:val="left"/>
-            </w:pPr>
-            <w:r/>
-            <w:r>
-              <w:rPr>
-                <w:rFonts w:ascii="微软雅黑" w:hAnsi="微软雅黑" w:eastAsia="微软雅黑"/>
-                <w:b w:val="0"/>
-                <w:sz w:val="18"/>
-              </w:rPr>
-              <w:t>地图绘制、蛇和食物显示、键盘输入、分数显示和界面刷新</w:t>
+              <w:t>main, InitGame, ResetGame, StartOrResumeGame, TogglePause, UpdateGame</w:t>
             </w:r>
           </w:p>
         </w:tc>
@@ -1045,23 +609,146 @@
     </w:tbl>
     <w:p/>
     <w:p>
+      <w:pPr>
+        <w:spacing w:line="300" w:lineRule="auto" w:after="120"/>
+      </w:pPr>
       <w:r>
-        <w:br w:type="page"/>
+        <w:rPr>
+          <w:rFonts w:ascii="微软雅黑" w:hAnsi="微软雅黑" w:eastAsia="微软雅黑"/>
+          <w:b w:val="0"/>
+          <w:color w:val="111827"/>
+          <w:sz w:val="21"/>
+        </w:rPr>
+        <w:t>详细步骤：</w:t>
       </w:r>
     </w:p>
     <w:p>
       <w:pPr>
-        <w:pStyle w:val="Heading1"/>
-        <w:spacing w:before="160" w:after="100"/>
+        <w:spacing w:line="300" w:lineRule="auto" w:after="120"/>
+      </w:pPr>
+      <w:r>
+        <w:rPr>
+          <w:rFonts w:ascii="微软雅黑" w:hAnsi="微软雅黑" w:eastAsia="微软雅黑"/>
+          <w:b w:val="0"/>
+          <w:color w:val="111827"/>
+          <w:sz w:val="21"/>
+        </w:rPr>
+        <w:t>1. 确认窗口大小、帧率和音频设备初始化正确。</w:t>
+      </w:r>
+    </w:p>
+    <w:p>
+      <w:pPr>
+        <w:spacing w:line="300" w:lineRule="auto" w:after="120"/>
+      </w:pPr>
+      <w:r>
+        <w:rPr>
+          <w:rFonts w:ascii="微软雅黑" w:hAnsi="微软雅黑" w:eastAsia="微软雅黑"/>
+          <w:b w:val="0"/>
+          <w:color w:val="111827"/>
+          <w:sz w:val="21"/>
+        </w:rPr>
+        <w:t>2. 维护开始前、运行中、暂停、游戏结束四种状态。</w:t>
+      </w:r>
+    </w:p>
+    <w:p>
+      <w:pPr>
+        <w:spacing w:line="300" w:lineRule="auto" w:after="120"/>
+      </w:pPr>
+      <w:r>
+        <w:rPr>
+          <w:rFonts w:ascii="微软雅黑" w:hAnsi="微软雅黑" w:eastAsia="微软雅黑"/>
+          <w:b w:val="0"/>
+          <w:color w:val="111827"/>
+          <w:sz w:val="21"/>
+        </w:rPr>
+        <w:t>3. 保证蛇移动使用固定时间步进，不受帧率波动影响。</w:t>
+      </w:r>
+    </w:p>
+    <w:p>
+      <w:pPr>
+        <w:spacing w:line="300" w:lineRule="auto" w:after="120"/>
+      </w:pPr>
+      <w:r>
+        <w:rPr>
+          <w:rFonts w:ascii="微软雅黑" w:hAnsi="微软雅黑" w:eastAsia="微软雅黑"/>
+          <w:b w:val="0"/>
+          <w:color w:val="111827"/>
+          <w:sz w:val="21"/>
+        </w:rPr>
+        <w:t>4. 和其他成员联调按钮、键盘和游戏结束流程。</w:t>
+      </w:r>
+    </w:p>
+    <w:p>
+      <w:pPr>
+        <w:spacing w:line="300" w:lineRule="auto" w:after="120"/>
+      </w:pPr>
+      <w:r>
+        <w:rPr>
+          <w:rFonts w:ascii="微软雅黑" w:hAnsi="微软雅黑" w:eastAsia="微软雅黑"/>
+          <w:b w:val="0"/>
+          <w:color w:val="111827"/>
+          <w:sz w:val="21"/>
+        </w:rPr>
+        <w:t>自测重点：</w:t>
+      </w:r>
+    </w:p>
+    <w:p>
+      <w:pPr>
+        <w:spacing w:line="300" w:lineRule="auto" w:after="80"/>
+        <w:ind w:left="369" w:hanging="198"/>
+      </w:pPr>
+      <w:r>
+        <w:rPr>
+          <w:rFonts w:ascii="微软雅黑" w:hAnsi="微软雅黑" w:eastAsia="微软雅黑"/>
+          <w:b w:val="0"/>
+          <w:color w:val="111827"/>
+          <w:sz w:val="21"/>
+        </w:rPr>
+        <w:t>• Space/P 可以暂停继续。</w:t>
+      </w:r>
+    </w:p>
+    <w:p>
+      <w:pPr>
+        <w:spacing w:line="300" w:lineRule="auto" w:after="80"/>
+        <w:ind w:left="369" w:hanging="198"/>
+      </w:pPr>
+      <w:r>
+        <w:rPr>
+          <w:rFonts w:ascii="微软雅黑" w:hAnsi="微软雅黑" w:eastAsia="微软雅黑"/>
+          <w:b w:val="0"/>
+          <w:color w:val="111827"/>
+          <w:sz w:val="21"/>
+        </w:rPr>
+        <w:t>• R 可以重新开始。</w:t>
+      </w:r>
+    </w:p>
+    <w:p>
+      <w:pPr>
+        <w:spacing w:line="300" w:lineRule="auto" w:after="80"/>
+        <w:ind w:left="369" w:hanging="198"/>
+      </w:pPr>
+      <w:r>
+        <w:rPr>
+          <w:rFonts w:ascii="微软雅黑" w:hAnsi="微软雅黑" w:eastAsia="微软雅黑"/>
+          <w:b w:val="0"/>
+          <w:color w:val="111827"/>
+          <w:sz w:val="21"/>
+        </w:rPr>
+        <w:t>• 游戏结束后 Enter 可以重开。</w:t>
+      </w:r>
+    </w:p>
+    <w:p>
+      <w:pPr>
+        <w:spacing w:before="180" w:after="80"/>
       </w:pPr>
       <w:r>
         <w:rPr>
           <w:rFonts w:ascii="微软雅黑" w:hAnsi="微软雅黑" w:eastAsia="微软雅黑"/>
           <w:b/>
-          <w:color w:val="0F766E"/>
-          <w:sz w:val="32"/>
+          <w:color w:val="1F4D78"/>
+          <w:sz w:val="26"/>
         </w:rPr>
-        <w:t>二、成员1：主程序框架与游戏状态管理</w:t>
+        <w:t>四、成员2：蛇身移动与碰撞规则</w:t>
       </w:r>
     </w:p>
     <w:tbl>
@@ -1072,27 +759,26 @@
         <w:tblLook w:firstColumn="1" w:firstRow="1" w:lastColumn="0" w:lastRow="0" w:noHBand="0" w:noVBand="1" w:val="04A0"/>
       </w:tblPr>
       <w:tblGrid>
-        <w:gridCol w:w="4929"/>
-        <w:gridCol w:w="4929"/>
+        <w:gridCol w:w="4986"/>
+        <w:gridCol w:w="4986"/>
       </w:tblGrid>
       <w:tr>
         <w:tc>
           <w:tcPr>
-            <w:tcW w:type="dxa" w:w="1587"/>
+            <w:tcW w:type="dxa" w:w="1701"/>
             <w:vAlign w:val="center"/>
-            <w:shd w:fill="0F766E"/>
+            <w:shd w:fill="E8EEF5"/>
           </w:tcPr>
           <w:p>
             <w:pPr>
-              <w:spacing w:before="0" w:after="40" w:line="276" w:lineRule="auto"/>
+              <w:spacing w:after="40"/>
               <w:jc w:val="center"/>
             </w:pPr>
-            <w:r/>
             <w:r>
               <w:rPr>
                 <w:rFonts w:ascii="微软雅黑" w:hAnsi="微软雅黑" w:eastAsia="微软雅黑"/>
                 <w:b/>
-                <w:color w:val="FFFFFF"/>
+                <w:color w:val="1F4D78"/>
                 <w:sz w:val="19"/>
               </w:rPr>
               <w:t>项目</w:t>
@@ -1101,21 +787,20 @@
         </w:tc>
         <w:tc>
           <w:tcPr>
-            <w:tcW w:type="dxa" w:w="6633"/>
+            <w:tcW w:type="dxa" w:w="6803"/>
             <w:vAlign w:val="center"/>
-            <w:shd w:fill="0F766E"/>
+            <w:shd w:fill="E8EEF5"/>
           </w:tcPr>
           <w:p>
             <w:pPr>
-              <w:spacing w:before="0" w:after="40" w:line="276" w:lineRule="auto"/>
+              <w:spacing w:after="40"/>
               <w:jc w:val="center"/>
             </w:pPr>
-            <w:r/>
             <w:r>
               <w:rPr>
                 <w:rFonts w:ascii="微软雅黑" w:hAnsi="微软雅黑" w:eastAsia="微软雅黑"/>
                 <w:b/>
-                <w:color w:val="FFFFFF"/>
+                <w:color w:val="1F4D78"/>
                 <w:sz w:val="19"/>
               </w:rPr>
               <w:t>内容</w:t>
@@ -1126,47 +811,41 @@
       <w:tr>
         <w:tc>
           <w:tcPr>
-            <w:tcW w:type="dxa" w:w="1587"/>
+            <w:tcW w:type="dxa" w:w="1701"/>
             <w:vAlign w:val="center"/>
           </w:tcPr>
           <w:p>
             <w:pPr>
-              <w:spacing w:before="0" w:after="40" w:line="276" w:lineRule="auto"/>
-              <w:jc w:val="left"/>
+              <w:spacing w:after="40"/>
             </w:pPr>
-            <w:r/>
             <w:r>
               <w:rPr>
                 <w:rFonts w:ascii="微软雅黑" w:hAnsi="微软雅黑" w:eastAsia="微软雅黑"/>
                 <w:b w:val="0"/>
+                <w:color w:val="111827"/>
                 <w:sz w:val="18"/>
               </w:rPr>
-              <w:t>负责文件</w:t>
+              <w:t>责任范围</w:t>
             </w:r>
           </w:p>
         </w:tc>
         <w:tc>
           <w:tcPr>
-            <w:tcW w:type="dxa" w:w="6633"/>
+            <w:tcW w:type="dxa" w:w="6803"/>
             <w:vAlign w:val="center"/>
           </w:tcPr>
           <w:p>
             <w:pPr>
-              <w:spacing w:before="0" w:after="40" w:line="276" w:lineRule="auto"/>
-              <w:jc w:val="left"/>
+              <w:spacing w:after="40"/>
             </w:pPr>
-            <w:r/>
             <w:r>
               <w:rPr>
                 <w:rFonts w:ascii="微软雅黑" w:hAnsi="微软雅黑" w:eastAsia="微软雅黑"/>
                 <w:b w:val="0"/>
+                <w:color w:val="111827"/>
                 <w:sz w:val="18"/>
               </w:rPr>
-              <w:t>src/main.c</w:t>
-              <w:br/>
-              <w:t>src/game.c</w:t>
-              <w:br/>
-              <w:t>src/game.h</w:t>
+              <w:t>蛇身数据、方向控制、禁止反向、移动增长、撞墙和撞自身。</w:t>
             </w:r>
           </w:p>
         </w:tc>
@@ -1174,87 +853,41 @@
       <w:tr>
         <w:tc>
           <w:tcPr>
-            <w:tcW w:type="dxa" w:w="1587"/>
+            <w:tcW w:type="dxa" w:w="1701"/>
             <w:vAlign w:val="center"/>
           </w:tcPr>
           <w:p>
             <w:pPr>
-              <w:spacing w:before="0" w:after="40" w:line="276" w:lineRule="auto"/>
-              <w:jc w:val="left"/>
+              <w:spacing w:after="40"/>
             </w:pPr>
-            <w:r/>
             <w:r>
               <w:rPr>
                 <w:rFonts w:ascii="微软雅黑" w:hAnsi="微软雅黑" w:eastAsia="微软雅黑"/>
                 <w:b w:val="0"/>
+                <w:color w:val="111827"/>
                 <w:sz w:val="18"/>
               </w:rPr>
-              <w:t>模块目标</w:t>
+              <w:t>主要函数</w:t>
             </w:r>
           </w:p>
         </w:tc>
         <w:tc>
           <w:tcPr>
-            <w:tcW w:type="dxa" w:w="6633"/>
+            <w:tcW w:type="dxa" w:w="6803"/>
             <w:vAlign w:val="center"/>
           </w:tcPr>
           <w:p>
             <w:pPr>
-              <w:spacing w:before="0" w:after="40" w:line="276" w:lineRule="auto"/>
-              <w:jc w:val="left"/>
+              <w:spacing w:after="40"/>
             </w:pPr>
-            <w:r/>
             <w:r>
               <w:rPr>
                 <w:rFonts w:ascii="微软雅黑" w:hAnsi="微软雅黑" w:eastAsia="微软雅黑"/>
                 <w:b w:val="0"/>
+                <w:color w:val="111827"/>
                 <w:sz w:val="18"/>
               </w:rPr>
-              <w:t>负责整个游戏流程的调度，把蛇身、食物、碰撞和界面模块按照正确顺序整合起来。</w:t>
-            </w:r>
-          </w:p>
-        </w:tc>
-      </w:tr>
-      <w:tr>
-        <w:tc>
-          <w:tcPr>
-            <w:tcW w:type="dxa" w:w="1587"/>
-            <w:vAlign w:val="center"/>
-          </w:tcPr>
-          <w:p>
-            <w:pPr>
-              <w:spacing w:before="0" w:after="40" w:line="276" w:lineRule="auto"/>
-              <w:jc w:val="left"/>
-            </w:pPr>
-            <w:r/>
-            <w:r>
-              <w:rPr>
-                <w:rFonts w:ascii="微软雅黑" w:hAnsi="微软雅黑" w:eastAsia="微软雅黑"/>
-                <w:b w:val="0"/>
-                <w:sz w:val="18"/>
-              </w:rPr>
-              <w:t>交付标准</w:t>
-            </w:r>
-          </w:p>
-        </w:tc>
-        <w:tc>
-          <w:tcPr>
-            <w:tcW w:type="dxa" w:w="6633"/>
-            <w:vAlign w:val="center"/>
-          </w:tcPr>
-          <w:p>
-            <w:pPr>
-              <w:spacing w:before="0" w:after="40" w:line="276" w:lineRule="auto"/>
-              <w:jc w:val="left"/>
-            </w:pPr>
-            <w:r/>
-            <w:r>
-              <w:rPr>
-                <w:rFonts w:ascii="微软雅黑" w:hAnsi="微软雅黑" w:eastAsia="微软雅黑"/>
-                <w:b w:val="0"/>
-                <w:sz w:val="18"/>
-              </w:rPr>
-              <w:t>程序能正常初始化、运行、暂停、继续、重新开始和退出；其他成员完成模块后可以顺利接入。</w:t>
+              <w:t>Snake, QueueDirection, MoveSnake, NextHead, SameCell, SnakeContains</w:t>
             </w:r>
           </w:p>
         </w:tc>
@@ -1263,203 +896,145 @@
     <w:p/>
     <w:p>
       <w:pPr>
-        <w:pStyle w:val="Heading2"/>
-        <w:spacing w:before="100" w:after="100"/>
+        <w:spacing w:line="300" w:lineRule="auto" w:after="120"/>
+      </w:pPr>
+      <w:r>
+        <w:rPr>
+          <w:rFonts w:ascii="微软雅黑" w:hAnsi="微软雅黑" w:eastAsia="微软雅黑"/>
+          <w:b w:val="0"/>
+          <w:color w:val="111827"/>
+          <w:sz w:val="21"/>
+        </w:rPr>
+        <w:t>详细步骤：</w:t>
+      </w:r>
+    </w:p>
+    <w:p>
+      <w:pPr>
+        <w:spacing w:line="300" w:lineRule="auto" w:after="120"/>
+      </w:pPr>
+      <w:r>
+        <w:rPr>
+          <w:rFonts w:ascii="微软雅黑" w:hAnsi="微软雅黑" w:eastAsia="微软雅黑"/>
+          <w:b w:val="0"/>
+          <w:color w:val="111827"/>
+          <w:sz w:val="21"/>
+        </w:rPr>
+        <w:t>1. 维护 body[0] 为蛇头、后续元素为蛇身的约定。</w:t>
+      </w:r>
+    </w:p>
+    <w:p>
+      <w:pPr>
+        <w:spacing w:line="300" w:lineRule="auto" w:after="120"/>
+      </w:pPr>
+      <w:r>
+        <w:rPr>
+          <w:rFonts w:ascii="微软雅黑" w:hAnsi="微软雅黑" w:eastAsia="微软雅黑"/>
+          <w:b w:val="0"/>
+          <w:color w:val="111827"/>
+          <w:sz w:val="21"/>
+        </w:rPr>
+        <w:t>2. 处理方向键和 WASD 传入后的方向队列。</w:t>
+      </w:r>
+    </w:p>
+    <w:p>
+      <w:pPr>
+        <w:spacing w:line="300" w:lineRule="auto" w:after="120"/>
+      </w:pPr>
+      <w:r>
+        <w:rPr>
+          <w:rFonts w:ascii="微软雅黑" w:hAnsi="微软雅黑" w:eastAsia="微软雅黑"/>
+          <w:b w:val="0"/>
+          <w:color w:val="111827"/>
+          <w:sz w:val="21"/>
+        </w:rPr>
+        <w:t>3. 吃到食物时增长，没吃到时正常移动。</w:t>
+      </w:r>
+    </w:p>
+    <w:p>
+      <w:pPr>
+        <w:spacing w:line="300" w:lineRule="auto" w:after="120"/>
+      </w:pPr>
+      <w:r>
+        <w:rPr>
+          <w:rFonts w:ascii="微软雅黑" w:hAnsi="微软雅黑" w:eastAsia="微软雅黑"/>
+          <w:b w:val="0"/>
+          <w:color w:val="111827"/>
+          <w:sz w:val="21"/>
+        </w:rPr>
+        <w:t>4. 判断撞墙和撞自身，并切换到游戏结束状态。</w:t>
+      </w:r>
+    </w:p>
+    <w:p>
+      <w:pPr>
+        <w:spacing w:line="300" w:lineRule="auto" w:after="120"/>
+      </w:pPr>
+      <w:r>
+        <w:rPr>
+          <w:rFonts w:ascii="微软雅黑" w:hAnsi="微软雅黑" w:eastAsia="微软雅黑"/>
+          <w:b w:val="0"/>
+          <w:color w:val="111827"/>
+          <w:sz w:val="21"/>
+        </w:rPr>
+        <w:t>自测重点：</w:t>
+      </w:r>
+    </w:p>
+    <w:p>
+      <w:pPr>
+        <w:spacing w:line="300" w:lineRule="auto" w:after="80"/>
+        <w:ind w:left="369" w:hanging="198"/>
+      </w:pPr>
+      <w:r>
+        <w:rPr>
+          <w:rFonts w:ascii="微软雅黑" w:hAnsi="微软雅黑" w:eastAsia="微软雅黑"/>
+          <w:b w:val="0"/>
+          <w:color w:val="111827"/>
+          <w:sz w:val="21"/>
+        </w:rPr>
+        <w:t>• 不能直接反向移动。</w:t>
+      </w:r>
+    </w:p>
+    <w:p>
+      <w:pPr>
+        <w:spacing w:line="300" w:lineRule="auto" w:after="80"/>
+        <w:ind w:left="369" w:hanging="198"/>
+      </w:pPr>
+      <w:r>
+        <w:rPr>
+          <w:rFonts w:ascii="微软雅黑" w:hAnsi="微软雅黑" w:eastAsia="微软雅黑"/>
+          <w:b w:val="0"/>
+          <w:color w:val="111827"/>
+          <w:sz w:val="21"/>
+        </w:rPr>
+        <w:t>• 吃食物后长度增加。</w:t>
+      </w:r>
+    </w:p>
+    <w:p>
+      <w:pPr>
+        <w:spacing w:line="300" w:lineRule="auto" w:after="80"/>
+        <w:ind w:left="369" w:hanging="198"/>
+      </w:pPr>
+      <w:r>
+        <w:rPr>
+          <w:rFonts w:ascii="微软雅黑" w:hAnsi="微软雅黑" w:eastAsia="微软雅黑"/>
+          <w:b w:val="0"/>
+          <w:color w:val="111827"/>
+          <w:sz w:val="21"/>
+        </w:rPr>
+        <w:t>• 撞墙和撞自身会结束游戏。</w:t>
+      </w:r>
+    </w:p>
+    <w:p>
+      <w:pPr>
+        <w:spacing w:before="180" w:after="80"/>
       </w:pPr>
       <w:r>
         <w:rPr>
           <w:rFonts w:ascii="微软雅黑" w:hAnsi="微软雅黑" w:eastAsia="微软雅黑"/>
           <w:b/>
-          <w:color w:val="374151"/>
-          <w:sz w:val="25"/>
+          <w:color w:val="1F4D78"/>
+          <w:sz w:val="26"/>
         </w:rPr>
-        <w:t>详细实施步骤</w:t>
-      </w:r>
-    </w:p>
-    <w:p>
-      <w:pPr>
-        <w:spacing w:line="288" w:lineRule="auto" w:after="40"/>
-        <w:ind w:left="454" w:hanging="283"/>
-      </w:pPr>
-      <w:r>
-        <w:rPr>
-          <w:rFonts w:ascii="微软雅黑" w:hAnsi="微软雅黑" w:eastAsia="微软雅黑"/>
-          <w:sz w:val="20"/>
-        </w:rPr>
-        <w:t>1. 阅读 src/types.h 中的 Game、Snake、Food、GameStatus 等结构体和枚举，确认游戏数据如何在各模块之间传递。</w:t>
-      </w:r>
-    </w:p>
-    <w:p>
-      <w:pPr>
-        <w:spacing w:line="288" w:lineRule="auto" w:after="40"/>
-        <w:ind w:left="454" w:hanging="283"/>
-      </w:pPr>
-      <w:r>
-        <w:rPr>
-          <w:rFonts w:ascii="微软雅黑" w:hAnsi="微软雅黑" w:eastAsia="微软雅黑"/>
-          <w:sz w:val="20"/>
-        </w:rPr>
-        <w:t>2. 完善 game_init：初始化随机数、调用 snake_init 初始化蛇、设置 score、level、speed_ms、status，并调用 food_spawn 生成初始食物。</w:t>
-      </w:r>
-    </w:p>
-    <w:p>
-      <w:pPr>
-        <w:spacing w:line="288" w:lineRule="auto" w:after="40"/>
-        <w:ind w:left="454" w:hanging="283"/>
-      </w:pPr>
-      <w:r>
-        <w:rPr>
-          <w:rFonts w:ascii="微软雅黑" w:hAnsi="微软雅黑" w:eastAsia="微软雅黑"/>
-          <w:sz w:val="20"/>
-        </w:rPr>
-        <w:t>3. 完善 game_handle_key：处理 Q 退出、R 重开、P 暂停/继续；当游戏处于运行状态时，将 W/A/S/D 转交给 snake_set_direction。</w:t>
-      </w:r>
-    </w:p>
-    <w:p>
-      <w:pPr>
-        <w:spacing w:line="288" w:lineRule="auto" w:after="40"/>
-        <w:ind w:left="454" w:hanging="283"/>
-      </w:pPr>
-      <w:r>
-        <w:rPr>
-          <w:rFonts w:ascii="微软雅黑" w:hAnsi="微软雅黑" w:eastAsia="微软雅黑"/>
-          <w:sz w:val="20"/>
-        </w:rPr>
-        <w:t>4. 完善 game_update：先判断游戏是否处于 GAME_RUNNING；再计算下一步蛇头位置；然后判断是否吃到食物、是否撞墙或撞自身。</w:t>
-      </w:r>
-    </w:p>
-    <w:p>
-      <w:pPr>
-        <w:spacing w:line="288" w:lineRule="auto" w:after="40"/>
-        <w:ind w:left="454" w:hanging="283"/>
-      </w:pPr>
-      <w:r>
-        <w:rPr>
-          <w:rFonts w:ascii="微软雅黑" w:hAnsi="微软雅黑" w:eastAsia="微软雅黑"/>
-          <w:sz w:val="20"/>
-        </w:rPr>
-        <w:t>5. 在 game_update 中按顺序调用 collision、snake_move、food_apply_score、food_spawn，保证游戏逻辑清晰。</w:t>
-      </w:r>
-    </w:p>
-    <w:p>
-      <w:pPr>
-        <w:spacing w:line="288" w:lineRule="auto" w:after="40"/>
-        <w:ind w:left="454" w:hanging="283"/>
-      </w:pPr>
-      <w:r>
-        <w:rPr>
-          <w:rFonts w:ascii="微软雅黑" w:hAnsi="微软雅黑" w:eastAsia="微软雅黑"/>
-          <w:sz w:val="20"/>
-        </w:rPr>
-        <w:t>6. 处理 GAME_OVER 和 GAME_VICTORY 状态，确保失败或胜利后不会继续自动移动。</w:t>
-      </w:r>
-    </w:p>
-    <w:p>
-      <w:pPr>
-        <w:spacing w:line="288" w:lineRule="auto" w:after="40"/>
-        <w:ind w:left="454" w:hanging="283"/>
-      </w:pPr>
-      <w:r>
-        <w:rPr>
-          <w:rFonts w:ascii="微软雅黑" w:hAnsi="微软雅黑" w:eastAsia="微软雅黑"/>
-          <w:sz w:val="20"/>
-        </w:rPr>
-        <w:t>7. 最后和其他成员联调，检查各模块函数返回值和调用顺序是否一致。</w:t>
-      </w:r>
-    </w:p>
-    <w:p>
-      <w:pPr>
-        <w:pStyle w:val="Heading2"/>
-        <w:spacing w:before="100" w:after="100"/>
-      </w:pPr>
-      <w:r>
-        <w:rPr>
-          <w:rFonts w:ascii="微软雅黑" w:hAnsi="微软雅黑" w:eastAsia="微软雅黑"/>
-          <w:b/>
-          <w:color w:val="374151"/>
-          <w:sz w:val="25"/>
-        </w:rPr>
-        <w:t>自测重点</w:t>
-      </w:r>
-    </w:p>
-    <w:p>
-      <w:pPr>
-        <w:spacing w:line="288" w:lineRule="auto" w:after="40"/>
-        <w:ind w:left="369" w:hanging="198"/>
-      </w:pPr>
-      <w:r>
-        <w:rPr>
-          <w:rFonts w:ascii="微软雅黑" w:hAnsi="微软雅黑" w:eastAsia="微软雅黑"/>
-          <w:sz w:val="21"/>
-        </w:rPr>
-        <w:t>• 启动游戏后分数为 0、等级为 1、状态为运行中。</w:t>
-      </w:r>
-    </w:p>
-    <w:p>
-      <w:pPr>
-        <w:spacing w:line="288" w:lineRule="auto" w:after="40"/>
-        <w:ind w:left="369" w:hanging="198"/>
-      </w:pPr>
-      <w:r>
-        <w:rPr>
-          <w:rFonts w:ascii="微软雅黑" w:hAnsi="微软雅黑" w:eastAsia="微软雅黑"/>
-          <w:sz w:val="21"/>
-        </w:rPr>
-        <w:t>• 按 P 能暂停，再按 P 能继续。</w:t>
-      </w:r>
-    </w:p>
-    <w:p>
-      <w:pPr>
-        <w:spacing w:line="288" w:lineRule="auto" w:after="40"/>
-        <w:ind w:left="369" w:hanging="198"/>
-      </w:pPr>
-      <w:r>
-        <w:rPr>
-          <w:rFonts w:ascii="微软雅黑" w:hAnsi="微软雅黑" w:eastAsia="微软雅黑"/>
-          <w:sz w:val="21"/>
-        </w:rPr>
-        <w:t>• 按 R 能重新开始，蛇、分数、速度和食物都恢复初始状态。</w:t>
-      </w:r>
-    </w:p>
-    <w:p>
-      <w:pPr>
-        <w:spacing w:line="288" w:lineRule="auto" w:after="40"/>
-        <w:ind w:left="369" w:hanging="198"/>
-      </w:pPr>
-      <w:r>
-        <w:rPr>
-          <w:rFonts w:ascii="微软雅黑" w:hAnsi="微软雅黑" w:eastAsia="微软雅黑"/>
-          <w:sz w:val="21"/>
-        </w:rPr>
-        <w:t>• 按 Q 能退出程序。</w:t>
-      </w:r>
-    </w:p>
-    <w:p>
-      <w:pPr>
-        <w:spacing w:line="288" w:lineRule="auto" w:after="40"/>
-        <w:ind w:left="369" w:hanging="198"/>
-      </w:pPr>
-      <w:r>
-        <w:rPr>
-          <w:rFonts w:ascii="微软雅黑" w:hAnsi="微软雅黑" w:eastAsia="微软雅黑"/>
-          <w:sz w:val="21"/>
-        </w:rPr>
-        <w:t>• 撞墙或撞自身后状态切换为 GAME_OVER。</w:t>
-      </w:r>
-    </w:p>
-    <w:p>
-      <w:pPr>
-        <w:pStyle w:val="Heading2"/>
-        <w:spacing w:before="100" w:after="100"/>
-      </w:pPr>
-      <w:r>
-        <w:rPr>
-          <w:rFonts w:ascii="微软雅黑" w:hAnsi="微软雅黑" w:eastAsia="微软雅黑"/>
-          <w:b/>
-          <w:color w:val="374151"/>
-          <w:sz w:val="25"/>
-        </w:rPr>
-        <w:t>建议提交命令</w:t>
+        <w:t>五、成员3：食物、计分、难度和最高分</w:t>
       </w:r>
     </w:p>
     <w:tbl>
@@ -1470,48 +1045,135 @@
         <w:tblLook w:firstColumn="1" w:firstRow="1" w:lastColumn="0" w:lastRow="0" w:noHBand="0" w:noVBand="1" w:val="04A0"/>
       </w:tblPr>
       <w:tblGrid>
-        <w:gridCol w:w="9858"/>
+        <w:gridCol w:w="4986"/>
+        <w:gridCol w:w="4986"/>
       </w:tblGrid>
       <w:tr>
         <w:tc>
           <w:tcPr>
-            <w:tcW w:type="dxa" w:w="9858"/>
-            <w:shd w:fill="F3F4F6"/>
+            <w:tcW w:type="dxa" w:w="1701"/>
+            <w:vAlign w:val="center"/>
+            <w:shd w:fill="E8EEF5"/>
+          </w:tcPr>
+          <w:p>
+            <w:pPr>
+              <w:spacing w:after="40"/>
+              <w:jc w:val="center"/>
+            </w:pPr>
+            <w:r>
+              <w:rPr>
+                <w:rFonts w:ascii="微软雅黑" w:hAnsi="微软雅黑" w:eastAsia="微软雅黑"/>
+                <w:b/>
+                <w:color w:val="1F4D78"/>
+                <w:sz w:val="19"/>
+              </w:rPr>
+              <w:t>项目</w:t>
+            </w:r>
+          </w:p>
+        </w:tc>
+        <w:tc>
+          <w:tcPr>
+            <w:tcW w:type="dxa" w:w="6803"/>
+            <w:vAlign w:val="center"/>
+            <w:shd w:fill="E8EEF5"/>
+          </w:tcPr>
+          <w:p>
+            <w:pPr>
+              <w:spacing w:after="40"/>
+              <w:jc w:val="center"/>
+            </w:pPr>
+            <w:r>
+              <w:rPr>
+                <w:rFonts w:ascii="微软雅黑" w:hAnsi="微软雅黑" w:eastAsia="微软雅黑"/>
+                <w:b/>
+                <w:color w:val="1F4D78"/>
+                <w:sz w:val="19"/>
+              </w:rPr>
+              <w:t>内容</w:t>
+            </w:r>
+          </w:p>
+        </w:tc>
+      </w:tr>
+      <w:tr>
+        <w:tc>
+          <w:tcPr>
+            <w:tcW w:type="dxa" w:w="1701"/>
             <w:vAlign w:val="center"/>
           </w:tcPr>
           <w:p>
             <w:pPr>
-              <w:spacing w:before="40" w:after="40"/>
+              <w:spacing w:after="40"/>
             </w:pPr>
             <w:r>
               <w:rPr>
-                <w:rFonts w:ascii="Consolas" w:hAnsi="Consolas" w:eastAsia="Consolas"/>
+                <w:rFonts w:ascii="微软雅黑" w:hAnsi="微软雅黑" w:eastAsia="微软雅黑"/>
+                <w:b w:val="0"/>
                 <w:color w:val="111827"/>
                 <w:sz w:val="18"/>
               </w:rPr>
-              <w:t>git add src\main.c src\game.c src\game.h</w:t>
+              <w:t>责任范围</w:t>
             </w:r>
-            <w:r>
-              <w:br/>
-            </w:r>
+          </w:p>
+        </w:tc>
+        <w:tc>
+          <w:tcPr>
+            <w:tcW w:type="dxa" w:w="6803"/>
+            <w:vAlign w:val="center"/>
+          </w:tcPr>
+          <w:p>
+            <w:pPr>
+              <w:spacing w:after="40"/>
+            </w:pPr>
             <w:r>
               <w:rPr>
-                <w:rFonts w:ascii="Consolas" w:hAnsi="Consolas" w:eastAsia="Consolas"/>
+                <w:rFonts w:ascii="微软雅黑" w:hAnsi="微软雅黑" w:eastAsia="微软雅黑"/>
+                <w:b w:val="0"/>
                 <w:color w:val="111827"/>
                 <w:sz w:val="18"/>
               </w:rPr>
-              <w:t>git commit -m "完成主程序和游戏状态管理模块"</w:t>
+              <w:t>食物刷新、得分、速度等级、最高分文件和食物视觉反馈。</w:t>
             </w:r>
-            <w:r>
-              <w:br/>
-            </w:r>
+          </w:p>
+        </w:tc>
+      </w:tr>
+      <w:tr>
+        <w:tc>
+          <w:tcPr>
+            <w:tcW w:type="dxa" w:w="1701"/>
+            <w:vAlign w:val="center"/>
+          </w:tcPr>
+          <w:p>
+            <w:pPr>
+              <w:spacing w:after="40"/>
+            </w:pPr>
             <w:r>
               <w:rPr>
-                <w:rFonts w:ascii="Consolas" w:hAnsi="Consolas" w:eastAsia="Consolas"/>
+                <w:rFonts w:ascii="微软雅黑" w:hAnsi="微软雅黑" w:eastAsia="微软雅黑"/>
+                <w:b w:val="0"/>
                 <w:color w:val="111827"/>
                 <w:sz w:val="18"/>
               </w:rPr>
-              <w:t>git push origin main</w:t>
+              <w:t>主要函数</w:t>
+            </w:r>
+          </w:p>
+        </w:tc>
+        <w:tc>
+          <w:tcPr>
+            <w:tcW w:type="dxa" w:w="6803"/>
+            <w:vAlign w:val="center"/>
+          </w:tcPr>
+          <w:p>
+            <w:pPr>
+              <w:spacing w:after="40"/>
+            </w:pPr>
+            <w:r>
+              <w:rPr>
+                <w:rFonts w:ascii="微软雅黑" w:hAnsi="微软雅黑" w:eastAsia="微软雅黑"/>
+                <w:b w:val="0"/>
+                <w:color w:val="111827"/>
+                <w:sz w:val="18"/>
+              </w:rPr>
+              <w:t>Food, SpawnFood, DrawFood, UpdateDifficulty, LoadHighScore, SaveHighScore</w:t>
             </w:r>
           </w:p>
         </w:tc>
@@ -1519,23 +1181,160 @@
     </w:tbl>
     <w:p/>
     <w:p>
+      <w:pPr>
+        <w:spacing w:line="300" w:lineRule="auto" w:after="120"/>
+      </w:pPr>
       <w:r>
-        <w:br w:type="page"/>
+        <w:rPr>
+          <w:rFonts w:ascii="微软雅黑" w:hAnsi="微软雅黑" w:eastAsia="微软雅黑"/>
+          <w:b w:val="0"/>
+          <w:color w:val="111827"/>
+          <w:sz w:val="21"/>
+        </w:rPr>
+        <w:t>详细步骤：</w:t>
       </w:r>
     </w:p>
     <w:p>
       <w:pPr>
-        <w:pStyle w:val="Heading1"/>
-        <w:spacing w:before="160" w:after="100"/>
+        <w:spacing w:line="300" w:lineRule="auto" w:after="120"/>
+      </w:pPr>
+      <w:r>
+        <w:rPr>
+          <w:rFonts w:ascii="微软雅黑" w:hAnsi="微软雅黑" w:eastAsia="微软雅黑"/>
+          <w:b w:val="0"/>
+          <w:color w:val="111827"/>
+          <w:sz w:val="21"/>
+        </w:rPr>
+        <w:t>1. 保证食物随机生成在棋盘内部。</w:t>
+      </w:r>
+    </w:p>
+    <w:p>
+      <w:pPr>
+        <w:spacing w:line="300" w:lineRule="auto" w:after="120"/>
+      </w:pPr>
+      <w:r>
+        <w:rPr>
+          <w:rFonts w:ascii="微软雅黑" w:hAnsi="微软雅黑" w:eastAsia="微软雅黑"/>
+          <w:b w:val="0"/>
+          <w:color w:val="111827"/>
+          <w:sz w:val="21"/>
+        </w:rPr>
+        <w:t>2. 避免食物生成在蛇身上。</w:t>
+      </w:r>
+    </w:p>
+    <w:p>
+      <w:pPr>
+        <w:spacing w:line="300" w:lineRule="auto" w:after="120"/>
+      </w:pPr>
+      <w:r>
+        <w:rPr>
+          <w:rFonts w:ascii="微软雅黑" w:hAnsi="微软雅黑" w:eastAsia="微软雅黑"/>
+          <w:b w:val="0"/>
+          <w:color w:val="111827"/>
+          <w:sz w:val="21"/>
+        </w:rPr>
+        <w:t>3. 吃到食物后加分、触发动画和音效反馈。</w:t>
+      </w:r>
+    </w:p>
+    <w:p>
+      <w:pPr>
+        <w:spacing w:line="300" w:lineRule="auto" w:after="120"/>
+      </w:pPr>
+      <w:r>
+        <w:rPr>
+          <w:rFonts w:ascii="微软雅黑" w:hAnsi="微软雅黑" w:eastAsia="微软雅黑"/>
+          <w:b w:val="0"/>
+          <w:color w:val="111827"/>
+          <w:sz w:val="21"/>
+        </w:rPr>
+        <w:t>4. 根据分数提升等级并逐步加快速度。</w:t>
+      </w:r>
+    </w:p>
+    <w:p>
+      <w:pPr>
+        <w:spacing w:line="300" w:lineRule="auto" w:after="120"/>
+      </w:pPr>
+      <w:r>
+        <w:rPr>
+          <w:rFonts w:ascii="微软雅黑" w:hAnsi="微软雅黑" w:eastAsia="微软雅黑"/>
+          <w:b w:val="0"/>
+          <w:color w:val="111827"/>
+          <w:sz w:val="21"/>
+        </w:rPr>
+        <w:t>5. 保存和读取 snake_raylib_highscore.dat。</w:t>
+      </w:r>
+    </w:p>
+    <w:p>
+      <w:pPr>
+        <w:spacing w:line="300" w:lineRule="auto" w:after="120"/>
+      </w:pPr>
+      <w:r>
+        <w:rPr>
+          <w:rFonts w:ascii="微软雅黑" w:hAnsi="微软雅黑" w:eastAsia="微软雅黑"/>
+          <w:b w:val="0"/>
+          <w:color w:val="111827"/>
+          <w:sz w:val="21"/>
+        </w:rPr>
+        <w:t>自测重点：</w:t>
+      </w:r>
+    </w:p>
+    <w:p>
+      <w:pPr>
+        <w:spacing w:line="300" w:lineRule="auto" w:after="80"/>
+        <w:ind w:left="369" w:hanging="198"/>
+      </w:pPr>
+      <w:r>
+        <w:rPr>
+          <w:rFonts w:ascii="微软雅黑" w:hAnsi="微软雅黑" w:eastAsia="微软雅黑"/>
+          <w:b w:val="0"/>
+          <w:color w:val="111827"/>
+          <w:sz w:val="21"/>
+        </w:rPr>
+        <w:t>• 食物不会和蛇重合。</w:t>
+      </w:r>
+    </w:p>
+    <w:p>
+      <w:pPr>
+        <w:spacing w:line="300" w:lineRule="auto" w:after="80"/>
+        <w:ind w:left="369" w:hanging="198"/>
+      </w:pPr>
+      <w:r>
+        <w:rPr>
+          <w:rFonts w:ascii="微软雅黑" w:hAnsi="微软雅黑" w:eastAsia="微软雅黑"/>
+          <w:b w:val="0"/>
+          <w:color w:val="111827"/>
+          <w:sz w:val="21"/>
+        </w:rPr>
+        <w:t>• 分数和最高分显示正确。</w:t>
+      </w:r>
+    </w:p>
+    <w:p>
+      <w:pPr>
+        <w:spacing w:line="300" w:lineRule="auto" w:after="80"/>
+        <w:ind w:left="369" w:hanging="198"/>
+      </w:pPr>
+      <w:r>
+        <w:rPr>
+          <w:rFonts w:ascii="微软雅黑" w:hAnsi="微软雅黑" w:eastAsia="微软雅黑"/>
+          <w:b w:val="0"/>
+          <w:color w:val="111827"/>
+          <w:sz w:val="21"/>
+        </w:rPr>
+        <w:t>• 速度条随等级变化。</w:t>
+      </w:r>
+    </w:p>
+    <w:p>
+      <w:pPr>
+        <w:spacing w:before="180" w:after="80"/>
       </w:pPr>
       <w:r>
         <w:rPr>
           <w:rFonts w:ascii="微软雅黑" w:hAnsi="微软雅黑" w:eastAsia="微软雅黑"/>
           <w:b/>
-          <w:color w:val="0F766E"/>
-          <w:sz w:val="32"/>
+          <w:color w:val="1F4D78"/>
+          <w:sz w:val="26"/>
         </w:rPr>
-        <w:t>三、成员2：蛇身移动与方向控制</w:t>
+        <w:t>六、成员4：棋盘、蛇身和背景视觉</w:t>
       </w:r>
     </w:p>
     <w:tbl>
@@ -1546,27 +1345,26 @@
         <w:tblLook w:firstColumn="1" w:firstRow="1" w:lastColumn="0" w:lastRow="0" w:noHBand="0" w:noVBand="1" w:val="04A0"/>
       </w:tblPr>
       <w:tblGrid>
-        <w:gridCol w:w="4929"/>
-        <w:gridCol w:w="4929"/>
+        <w:gridCol w:w="4986"/>
+        <w:gridCol w:w="4986"/>
       </w:tblGrid>
       <w:tr>
         <w:tc>
           <w:tcPr>
-            <w:tcW w:type="dxa" w:w="1587"/>
+            <w:tcW w:type="dxa" w:w="1701"/>
             <w:vAlign w:val="center"/>
-            <w:shd w:fill="0F766E"/>
+            <w:shd w:fill="E8EEF5"/>
           </w:tcPr>
           <w:p>
             <w:pPr>
-              <w:spacing w:before="0" w:after="40" w:line="276" w:lineRule="auto"/>
+              <w:spacing w:after="40"/>
               <w:jc w:val="center"/>
             </w:pPr>
-            <w:r/>
             <w:r>
               <w:rPr>
                 <w:rFonts w:ascii="微软雅黑" w:hAnsi="微软雅黑" w:eastAsia="微软雅黑"/>
                 <w:b/>
-                <w:color w:val="FFFFFF"/>
+                <w:color w:val="1F4D78"/>
                 <w:sz w:val="19"/>
               </w:rPr>
               <w:t>项目</w:t>
@@ -1575,21 +1373,20 @@
         </w:tc>
         <w:tc>
           <w:tcPr>
-            <w:tcW w:type="dxa" w:w="6633"/>
+            <w:tcW w:type="dxa" w:w="6803"/>
             <w:vAlign w:val="center"/>
-            <w:shd w:fill="0F766E"/>
+            <w:shd w:fill="E8EEF5"/>
           </w:tcPr>
           <w:p>
             <w:pPr>
-              <w:spacing w:before="0" w:after="40" w:line="276" w:lineRule="auto"/>
+              <w:spacing w:after="40"/>
               <w:jc w:val="center"/>
             </w:pPr>
-            <w:r/>
             <w:r>
               <w:rPr>
                 <w:rFonts w:ascii="微软雅黑" w:hAnsi="微软雅黑" w:eastAsia="微软雅黑"/>
                 <w:b/>
-                <w:color w:val="FFFFFF"/>
+                <w:color w:val="1F4D78"/>
                 <w:sz w:val="19"/>
               </w:rPr>
               <w:t>内容</w:t>
@@ -1600,45 +1397,41 @@
       <w:tr>
         <w:tc>
           <w:tcPr>
-            <w:tcW w:type="dxa" w:w="1587"/>
+            <w:tcW w:type="dxa" w:w="1701"/>
             <w:vAlign w:val="center"/>
           </w:tcPr>
           <w:p>
             <w:pPr>
-              <w:spacing w:before="0" w:after="40" w:line="276" w:lineRule="auto"/>
-              <w:jc w:val="left"/>
+              <w:spacing w:after="40"/>
             </w:pPr>
-            <w:r/>
             <w:r>
               <w:rPr>
                 <w:rFonts w:ascii="微软雅黑" w:hAnsi="微软雅黑" w:eastAsia="微软雅黑"/>
                 <w:b w:val="0"/>
+                <w:color w:val="111827"/>
                 <w:sz w:val="18"/>
               </w:rPr>
-              <w:t>负责文件</w:t>
+              <w:t>责任范围</w:t>
             </w:r>
           </w:p>
         </w:tc>
         <w:tc>
           <w:tcPr>
-            <w:tcW w:type="dxa" w:w="6633"/>
+            <w:tcW w:type="dxa" w:w="6803"/>
             <w:vAlign w:val="center"/>
           </w:tcPr>
           <w:p>
             <w:pPr>
-              <w:spacing w:before="0" w:after="40" w:line="276" w:lineRule="auto"/>
-              <w:jc w:val="left"/>
+              <w:spacing w:after="40"/>
             </w:pPr>
-            <w:r/>
             <w:r>
               <w:rPr>
                 <w:rFonts w:ascii="微软雅黑" w:hAnsi="微软雅黑" w:eastAsia="微软雅黑"/>
                 <w:b w:val="0"/>
+                <w:color w:val="111827"/>
                 <w:sz w:val="18"/>
               </w:rPr>
-              <w:t>src/snake.c</w:t>
-              <w:br/>
-              <w:t>src/snake.h</w:t>
+              <w:t>现代街机风格背景、棋盘边界、网格、蛇身层次和蛇头方向表现。</w:t>
             </w:r>
           </w:p>
         </w:tc>
@@ -1646,87 +1439,41 @@
       <w:tr>
         <w:tc>
           <w:tcPr>
-            <w:tcW w:type="dxa" w:w="1587"/>
+            <w:tcW w:type="dxa" w:w="1701"/>
             <w:vAlign w:val="center"/>
           </w:tcPr>
           <w:p>
             <w:pPr>
-              <w:spacing w:before="0" w:after="40" w:line="276" w:lineRule="auto"/>
-              <w:jc w:val="left"/>
+              <w:spacing w:after="40"/>
             </w:pPr>
-            <w:r/>
             <w:r>
               <w:rPr>
                 <w:rFonts w:ascii="微软雅黑" w:hAnsi="微软雅黑" w:eastAsia="微软雅黑"/>
                 <w:b w:val="0"/>
+                <w:color w:val="111827"/>
                 <w:sz w:val="18"/>
               </w:rPr>
-              <w:t>模块目标</w:t>
+              <w:t>主要函数</w:t>
             </w:r>
           </w:p>
         </w:tc>
         <w:tc>
           <w:tcPr>
-            <w:tcW w:type="dxa" w:w="6633"/>
+            <w:tcW w:type="dxa" w:w="6803"/>
             <w:vAlign w:val="center"/>
           </w:tcPr>
           <w:p>
             <w:pPr>
-              <w:spacing w:before="0" w:after="40" w:line="276" w:lineRule="auto"/>
-              <w:jc w:val="left"/>
+              <w:spacing w:after="40"/>
             </w:pPr>
-            <w:r/>
             <w:r>
               <w:rPr>
                 <w:rFonts w:ascii="微软雅黑" w:hAnsi="微软雅黑" w:eastAsia="微软雅黑"/>
                 <w:b w:val="0"/>
+                <w:color w:val="111827"/>
                 <w:sz w:val="18"/>
               </w:rPr>
-              <w:t>负责蛇的核心移动逻辑，包括蛇身数据、方向切换、蛇头前进、蛇身跟随和吃食物后的增长。</w:t>
-            </w:r>
-          </w:p>
-        </w:tc>
-      </w:tr>
-      <w:tr>
-        <w:tc>
-          <w:tcPr>
-            <w:tcW w:type="dxa" w:w="1587"/>
-            <w:vAlign w:val="center"/>
-          </w:tcPr>
-          <w:p>
-            <w:pPr>
-              <w:spacing w:before="0" w:after="40" w:line="276" w:lineRule="auto"/>
-              <w:jc w:val="left"/>
-            </w:pPr>
-            <w:r/>
-            <w:r>
-              <w:rPr>
-                <w:rFonts w:ascii="微软雅黑" w:hAnsi="微软雅黑" w:eastAsia="微软雅黑"/>
-                <w:b w:val="0"/>
-                <w:sz w:val="18"/>
-              </w:rPr>
-              <w:t>交付标准</w:t>
-            </w:r>
-          </w:p>
-        </w:tc>
-        <w:tc>
-          <w:tcPr>
-            <w:tcW w:type="dxa" w:w="6633"/>
-            <w:vAlign w:val="center"/>
-          </w:tcPr>
-          <w:p>
-            <w:pPr>
-              <w:spacing w:before="0" w:after="40" w:line="276" w:lineRule="auto"/>
-              <w:jc w:val="left"/>
-            </w:pPr>
-            <w:r/>
-            <w:r>
-              <w:rPr>
-                <w:rFonts w:ascii="微软雅黑" w:hAnsi="微软雅黑" w:eastAsia="微软雅黑"/>
-                <w:b w:val="0"/>
-                <w:sz w:val="18"/>
-              </w:rPr>
-              <w:t>蛇可以按照方向连续移动，不能直接反向移动，吃到食物后长度增加，蛇身坐标维护正确。</w:t>
+              <w:t>DrawBackground, DrawHeader, DrawBoardFrame, DrawBoardGrid, DrawSnake, DrawSnakeEyes</w:t>
             </w:r>
           </w:p>
         </w:tc>
@@ -1735,203 +1482,145 @@
     <w:p/>
     <w:p>
       <w:pPr>
-        <w:pStyle w:val="Heading2"/>
-        <w:spacing w:before="100" w:after="100"/>
+        <w:spacing w:line="300" w:lineRule="auto" w:after="120"/>
+      </w:pPr>
+      <w:r>
+        <w:rPr>
+          <w:rFonts w:ascii="微软雅黑" w:hAnsi="微软雅黑" w:eastAsia="微软雅黑"/>
+          <w:b w:val="0"/>
+          <w:color w:val="111827"/>
+          <w:sz w:val="21"/>
+        </w:rPr>
+        <w:t>详细步骤：</w:t>
+      </w:r>
+    </w:p>
+    <w:p>
+      <w:pPr>
+        <w:spacing w:line="300" w:lineRule="auto" w:after="120"/>
+      </w:pPr>
+      <w:r>
+        <w:rPr>
+          <w:rFonts w:ascii="微软雅黑" w:hAnsi="微软雅黑" w:eastAsia="微软雅黑"/>
+          <w:b w:val="0"/>
+          <w:color w:val="111827"/>
+          <w:sz w:val="21"/>
+        </w:rPr>
+        <w:t>1. 保持 960x720 下棋盘和面板不重叠。</w:t>
+      </w:r>
+    </w:p>
+    <w:p>
+      <w:pPr>
+        <w:spacing w:line="300" w:lineRule="auto" w:after="120"/>
+      </w:pPr>
+      <w:r>
+        <w:rPr>
+          <w:rFonts w:ascii="微软雅黑" w:hAnsi="微软雅黑" w:eastAsia="微软雅黑"/>
+          <w:b w:val="0"/>
+          <w:color w:val="111827"/>
+          <w:sz w:val="21"/>
+        </w:rPr>
+        <w:t>2. 绘制深色背景、轻微网格和棋盘阴影。</w:t>
+      </w:r>
+    </w:p>
+    <w:p>
+      <w:pPr>
+        <w:spacing w:line="300" w:lineRule="auto" w:after="120"/>
+      </w:pPr>
+      <w:r>
+        <w:rPr>
+          <w:rFonts w:ascii="微软雅黑" w:hAnsi="微软雅黑" w:eastAsia="微软雅黑"/>
+          <w:b w:val="0"/>
+          <w:color w:val="111827"/>
+          <w:sz w:val="21"/>
+        </w:rPr>
+        <w:t>3. 绘制圆角蛇身、颜色层次和高光。</w:t>
+      </w:r>
+    </w:p>
+    <w:p>
+      <w:pPr>
+        <w:spacing w:line="300" w:lineRule="auto" w:after="120"/>
+      </w:pPr>
+      <w:r>
+        <w:rPr>
+          <w:rFonts w:ascii="微软雅黑" w:hAnsi="微软雅黑" w:eastAsia="微软雅黑"/>
+          <w:b w:val="0"/>
+          <w:color w:val="111827"/>
+          <w:sz w:val="21"/>
+        </w:rPr>
+        <w:t>4. 根据方向绘制蛇头眼睛，让朝向清楚。</w:t>
+      </w:r>
+    </w:p>
+    <w:p>
+      <w:pPr>
+        <w:spacing w:line="300" w:lineRule="auto" w:after="120"/>
+      </w:pPr>
+      <w:r>
+        <w:rPr>
+          <w:rFonts w:ascii="微软雅黑" w:hAnsi="微软雅黑" w:eastAsia="微软雅黑"/>
+          <w:b w:val="0"/>
+          <w:color w:val="111827"/>
+          <w:sz w:val="21"/>
+        </w:rPr>
+        <w:t>自测重点：</w:t>
+      </w:r>
+    </w:p>
+    <w:p>
+      <w:pPr>
+        <w:spacing w:line="300" w:lineRule="auto" w:after="80"/>
+        <w:ind w:left="369" w:hanging="198"/>
+      </w:pPr>
+      <w:r>
+        <w:rPr>
+          <w:rFonts w:ascii="微软雅黑" w:hAnsi="微软雅黑" w:eastAsia="微软雅黑"/>
+          <w:b w:val="0"/>
+          <w:color w:val="111827"/>
+          <w:sz w:val="21"/>
+        </w:rPr>
+        <w:t>• 棋盘居中且边界清晰。</w:t>
+      </w:r>
+    </w:p>
+    <w:p>
+      <w:pPr>
+        <w:spacing w:line="300" w:lineRule="auto" w:after="80"/>
+        <w:ind w:left="369" w:hanging="198"/>
+      </w:pPr>
+      <w:r>
+        <w:rPr>
+          <w:rFonts w:ascii="微软雅黑" w:hAnsi="微软雅黑" w:eastAsia="微软雅黑"/>
+          <w:b w:val="0"/>
+          <w:color w:val="111827"/>
+          <w:sz w:val="21"/>
+        </w:rPr>
+        <w:t>• 蛇身不是字符块。</w:t>
+      </w:r>
+    </w:p>
+    <w:p>
+      <w:pPr>
+        <w:spacing w:line="300" w:lineRule="auto" w:after="80"/>
+        <w:ind w:left="369" w:hanging="198"/>
+      </w:pPr>
+      <w:r>
+        <w:rPr>
+          <w:rFonts w:ascii="微软雅黑" w:hAnsi="微软雅黑" w:eastAsia="微软雅黑"/>
+          <w:b w:val="0"/>
+          <w:color w:val="111827"/>
+          <w:sz w:val="21"/>
+        </w:rPr>
+        <w:t>• 蛇头方向可识别。</w:t>
+      </w:r>
+    </w:p>
+    <w:p>
+      <w:pPr>
+        <w:spacing w:before="180" w:after="80"/>
       </w:pPr>
       <w:r>
         <w:rPr>
           <w:rFonts w:ascii="微软雅黑" w:hAnsi="微软雅黑" w:eastAsia="微软雅黑"/>
           <w:b/>
-          <w:color w:val="374151"/>
-          <w:sz w:val="25"/>
+          <w:color w:val="1F4D78"/>
+          <w:sz w:val="26"/>
         </w:rPr>
-        <w:t>详细实施步骤</w:t>
-      </w:r>
-    </w:p>
-    <w:p>
-      <w:pPr>
-        <w:spacing w:line="288" w:lineRule="auto" w:after="40"/>
-        <w:ind w:left="454" w:hanging="283"/>
-      </w:pPr>
-      <w:r>
-        <w:rPr>
-          <w:rFonts w:ascii="微软雅黑" w:hAnsi="微软雅黑" w:eastAsia="微软雅黑"/>
-          <w:sz w:val="20"/>
-        </w:rPr>
-        <w:t>1. 阅读 Snake 结构体，理解 body 数组中 body[0] 表示蛇头，后续元素表示蛇身。</w:t>
-      </w:r>
-    </w:p>
-    <w:p>
-      <w:pPr>
-        <w:spacing w:line="288" w:lineRule="auto" w:after="40"/>
-        <w:ind w:left="454" w:hanging="283"/>
-      </w:pPr>
-      <w:r>
-        <w:rPr>
-          <w:rFonts w:ascii="微软雅黑" w:hAnsi="微软雅黑" w:eastAsia="微软雅黑"/>
-          <w:sz w:val="20"/>
-        </w:rPr>
-        <w:t>2. 完善 snake_init：设置初始长度为 INITIAL_SNAKE_LENGTH，把蛇放在地图中心附近，默认方向为 DIR_RIGHT。</w:t>
-      </w:r>
-    </w:p>
-    <w:p>
-      <w:pPr>
-        <w:spacing w:line="288" w:lineRule="auto" w:after="40"/>
-        <w:ind w:left="454" w:hanging="283"/>
-      </w:pPr>
-      <w:r>
-        <w:rPr>
-          <w:rFonts w:ascii="微软雅黑" w:hAnsi="微软雅黑" w:eastAsia="微软雅黑"/>
-          <w:sz w:val="20"/>
-        </w:rPr>
-        <w:t>3. 完善 snake_set_direction：判断新方向是否与当前方向相反；如果相反则忽略，避免蛇直接掉头撞到自己。</w:t>
-      </w:r>
-    </w:p>
-    <w:p>
-      <w:pPr>
-        <w:spacing w:line="288" w:lineRule="auto" w:after="40"/>
-        <w:ind w:left="454" w:hanging="283"/>
-      </w:pPr>
-      <w:r>
-        <w:rPr>
-          <w:rFonts w:ascii="微软雅黑" w:hAnsi="微软雅黑" w:eastAsia="微软雅黑"/>
-          <w:sz w:val="20"/>
-        </w:rPr>
-        <w:t>4. 完善 snake_next_head：根据 next_direction 返回下一步蛇头坐标，不直接修改蛇身。</w:t>
-      </w:r>
-    </w:p>
-    <w:p>
-      <w:pPr>
-        <w:spacing w:line="288" w:lineRule="auto" w:after="40"/>
-        <w:ind w:left="454" w:hanging="283"/>
-      </w:pPr>
-      <w:r>
-        <w:rPr>
-          <w:rFonts w:ascii="微软雅黑" w:hAnsi="微软雅黑" w:eastAsia="微软雅黑"/>
-          <w:sz w:val="20"/>
-        </w:rPr>
-        <w:t>5. 完善 snake_move：从尾部开始倒序移动蛇身，使每一节跟随前一节；最后把 body[0] 设置为新蛇头。</w:t>
-      </w:r>
-    </w:p>
-    <w:p>
-      <w:pPr>
-        <w:spacing w:line="288" w:lineRule="auto" w:after="40"/>
-        <w:ind w:left="454" w:hanging="283"/>
-      </w:pPr>
-      <w:r>
-        <w:rPr>
-          <w:rFonts w:ascii="微软雅黑" w:hAnsi="微软雅黑" w:eastAsia="微软雅黑"/>
-          <w:sz w:val="20"/>
-        </w:rPr>
-        <w:t>6. 处理 grow 参数：grow 为真时长度加 1，尾巴保留；grow 为假时正常移动，长度不变。</w:t>
-      </w:r>
-    </w:p>
-    <w:p>
-      <w:pPr>
-        <w:spacing w:line="288" w:lineRule="auto" w:after="40"/>
-        <w:ind w:left="454" w:hanging="283"/>
-      </w:pPr>
-      <w:r>
-        <w:rPr>
-          <w:rFonts w:ascii="微软雅黑" w:hAnsi="微软雅黑" w:eastAsia="微软雅黑"/>
-          <w:sz w:val="20"/>
-        </w:rPr>
-        <w:t>7. 完善 snake_contains_point 和 snake_contains_point_from_index，用于判断食物是否生成在蛇身上、碰撞是否发生。</w:t>
-      </w:r>
-    </w:p>
-    <w:p>
-      <w:pPr>
-        <w:pStyle w:val="Heading2"/>
-        <w:spacing w:before="100" w:after="100"/>
-      </w:pPr>
-      <w:r>
-        <w:rPr>
-          <w:rFonts w:ascii="微软雅黑" w:hAnsi="微软雅黑" w:eastAsia="微软雅黑"/>
-          <w:b/>
-          <w:color w:val="374151"/>
-          <w:sz w:val="25"/>
-        </w:rPr>
-        <w:t>自测重点</w:t>
-      </w:r>
-    </w:p>
-    <w:p>
-      <w:pPr>
-        <w:spacing w:line="288" w:lineRule="auto" w:after="40"/>
-        <w:ind w:left="369" w:hanging="198"/>
-      </w:pPr>
-      <w:r>
-        <w:rPr>
-          <w:rFonts w:ascii="微软雅黑" w:hAnsi="微软雅黑" w:eastAsia="微软雅黑"/>
-          <w:sz w:val="21"/>
-        </w:rPr>
-        <w:t>• 蛇能向上、下、左、右移动。</w:t>
-      </w:r>
-    </w:p>
-    <w:p>
-      <w:pPr>
-        <w:spacing w:line="288" w:lineRule="auto" w:after="40"/>
-        <w:ind w:left="369" w:hanging="198"/>
-      </w:pPr>
-      <w:r>
-        <w:rPr>
-          <w:rFonts w:ascii="微软雅黑" w:hAnsi="微软雅黑" w:eastAsia="微软雅黑"/>
-          <w:sz w:val="21"/>
-        </w:rPr>
-        <w:t>• 向右移动时按 A 不会立刻反向；向上移动时按 S 不会立刻反向。</w:t>
-      </w:r>
-    </w:p>
-    <w:p>
-      <w:pPr>
-        <w:spacing w:line="288" w:lineRule="auto" w:after="40"/>
-        <w:ind w:left="369" w:hanging="198"/>
-      </w:pPr>
-      <w:r>
-        <w:rPr>
-          <w:rFonts w:ascii="微软雅黑" w:hAnsi="微软雅黑" w:eastAsia="微软雅黑"/>
-          <w:sz w:val="21"/>
-        </w:rPr>
-        <w:t>• 吃到食物后蛇身长度增加 1。</w:t>
-      </w:r>
-    </w:p>
-    <w:p>
-      <w:pPr>
-        <w:spacing w:line="288" w:lineRule="auto" w:after="40"/>
-        <w:ind w:left="369" w:hanging="198"/>
-      </w:pPr>
-      <w:r>
-        <w:rPr>
-          <w:rFonts w:ascii="微软雅黑" w:hAnsi="微软雅黑" w:eastAsia="微软雅黑"/>
-          <w:sz w:val="21"/>
-        </w:rPr>
-        <w:t>• 连续移动时蛇身跟随自然，没有断裂或重叠异常。</w:t>
-      </w:r>
-    </w:p>
-    <w:p>
-      <w:pPr>
-        <w:spacing w:line="288" w:lineRule="auto" w:after="40"/>
-        <w:ind w:left="369" w:hanging="198"/>
-      </w:pPr>
-      <w:r>
-        <w:rPr>
-          <w:rFonts w:ascii="微软雅黑" w:hAnsi="微软雅黑" w:eastAsia="微软雅黑"/>
-          <w:sz w:val="21"/>
-        </w:rPr>
-        <w:t>• snake_contains_point 能正确识别蛇头和蛇身坐标。</w:t>
-      </w:r>
-    </w:p>
-    <w:p>
-      <w:pPr>
-        <w:pStyle w:val="Heading2"/>
-        <w:spacing w:before="100" w:after="100"/>
-      </w:pPr>
-      <w:r>
-        <w:rPr>
-          <w:rFonts w:ascii="微软雅黑" w:hAnsi="微软雅黑" w:eastAsia="微软雅黑"/>
-          <w:b/>
-          <w:color w:val="374151"/>
-          <w:sz w:val="25"/>
-        </w:rPr>
-        <w:t>建议提交命令</w:t>
+        <w:t>七、成员5：面板、按钮、弹窗和构建说明</w:t>
       </w:r>
     </w:p>
     <w:tbl>
@@ -1942,103 +1631,26 @@
         <w:tblLook w:firstColumn="1" w:firstRow="1" w:lastColumn="0" w:lastRow="0" w:noHBand="0" w:noVBand="1" w:val="04A0"/>
       </w:tblPr>
       <w:tblGrid>
-        <w:gridCol w:w="9858"/>
+        <w:gridCol w:w="4986"/>
+        <w:gridCol w:w="4986"/>
       </w:tblGrid>
       <w:tr>
         <w:tc>
           <w:tcPr>
-            <w:tcW w:type="dxa" w:w="9858"/>
-            <w:shd w:fill="F3F4F6"/>
+            <w:tcW w:type="dxa" w:w="1701"/>
             <w:vAlign w:val="center"/>
+            <w:shd w:fill="E8EEF5"/>
           </w:tcPr>
           <w:p>
             <w:pPr>
-              <w:spacing w:before="40" w:after="40"/>
-            </w:pPr>
-            <w:r>
-              <w:rPr>
-                <w:rFonts w:ascii="Consolas" w:hAnsi="Consolas" w:eastAsia="Consolas"/>
-                <w:color w:val="111827"/>
-                <w:sz w:val="18"/>
-              </w:rPr>
-              <w:t>git add src\snake.c src\snake.h</w:t>
-            </w:r>
-            <w:r>
-              <w:br/>
-            </w:r>
-            <w:r>
-              <w:rPr>
-                <w:rFonts w:ascii="Consolas" w:hAnsi="Consolas" w:eastAsia="Consolas"/>
-                <w:color w:val="111827"/>
-                <w:sz w:val="18"/>
-              </w:rPr>
-              <w:t>git commit -m "完成蛇身移动和方向控制模块"</w:t>
-            </w:r>
-            <w:r>
-              <w:br/>
-            </w:r>
-            <w:r>
-              <w:rPr>
-                <w:rFonts w:ascii="Consolas" w:hAnsi="Consolas" w:eastAsia="Consolas"/>
-                <w:color w:val="111827"/>
-                <w:sz w:val="18"/>
-              </w:rPr>
-              <w:t>git push origin main</w:t>
-            </w:r>
-          </w:p>
-        </w:tc>
-      </w:tr>
-    </w:tbl>
-    <w:p/>
-    <w:p>
-      <w:r>
-        <w:br w:type="page"/>
-      </w:r>
-    </w:p>
-    <w:p>
-      <w:pPr>
-        <w:pStyle w:val="Heading1"/>
-        <w:spacing w:before="160" w:after="100"/>
-      </w:pPr>
-      <w:r>
-        <w:rPr>
-          <w:rFonts w:ascii="微软雅黑" w:hAnsi="微软雅黑" w:eastAsia="微软雅黑"/>
-          <w:b/>
-          <w:color w:val="0F766E"/>
-          <w:sz w:val="32"/>
-        </w:rPr>
-        <w:t>四、成员3：食物生成、得分与难度变化</w:t>
-      </w:r>
-    </w:p>
-    <w:tbl>
-      <w:tblPr>
-        <w:tblStyle w:val="TableGrid"/>
-        <w:tblW w:type="auto" w:w="0"/>
-        <w:jc w:val="center"/>
-        <w:tblLook w:firstColumn="1" w:firstRow="1" w:lastColumn="0" w:lastRow="0" w:noHBand="0" w:noVBand="1" w:val="04A0"/>
-      </w:tblPr>
-      <w:tblGrid>
-        <w:gridCol w:w="4929"/>
-        <w:gridCol w:w="4929"/>
-      </w:tblGrid>
-      <w:tr>
-        <w:tc>
-          <w:tcPr>
-            <w:tcW w:type="dxa" w:w="1587"/>
-            <w:vAlign w:val="center"/>
-            <w:shd w:fill="0F766E"/>
-          </w:tcPr>
-          <w:p>
-            <w:pPr>
-              <w:spacing w:before="0" w:after="40" w:line="276" w:lineRule="auto"/>
+              <w:spacing w:after="40"/>
               <w:jc w:val="center"/>
             </w:pPr>
-            <w:r/>
             <w:r>
               <w:rPr>
                 <w:rFonts w:ascii="微软雅黑" w:hAnsi="微软雅黑" w:eastAsia="微软雅黑"/>
                 <w:b/>
-                <w:color w:val="FFFFFF"/>
+                <w:color w:val="1F4D78"/>
                 <w:sz w:val="19"/>
               </w:rPr>
               <w:t>项目</w:t>
@@ -2047,21 +1659,20 @@
         </w:tc>
         <w:tc>
           <w:tcPr>
-            <w:tcW w:type="dxa" w:w="6633"/>
+            <w:tcW w:type="dxa" w:w="6803"/>
             <w:vAlign w:val="center"/>
-            <w:shd w:fill="0F766E"/>
+            <w:shd w:fill="E8EEF5"/>
           </w:tcPr>
           <w:p>
             <w:pPr>
-              <w:spacing w:before="0" w:after="40" w:line="276" w:lineRule="auto"/>
+              <w:spacing w:after="40"/>
               <w:jc w:val="center"/>
             </w:pPr>
-            <w:r/>
             <w:r>
               <w:rPr>
                 <w:rFonts w:ascii="微软雅黑" w:hAnsi="微软雅黑" w:eastAsia="微软雅黑"/>
                 <w:b/>
-                <w:color w:val="FFFFFF"/>
+                <w:color w:val="1F4D78"/>
                 <w:sz w:val="19"/>
               </w:rPr>
               <w:t>内容</w:t>
@@ -2072,45 +1683,41 @@
       <w:tr>
         <w:tc>
           <w:tcPr>
-            <w:tcW w:type="dxa" w:w="1587"/>
+            <w:tcW w:type="dxa" w:w="1701"/>
             <w:vAlign w:val="center"/>
           </w:tcPr>
           <w:p>
             <w:pPr>
-              <w:spacing w:before="0" w:after="40" w:line="276" w:lineRule="auto"/>
-              <w:jc w:val="left"/>
+              <w:spacing w:after="40"/>
             </w:pPr>
-            <w:r/>
             <w:r>
               <w:rPr>
                 <w:rFonts w:ascii="微软雅黑" w:hAnsi="微软雅黑" w:eastAsia="微软雅黑"/>
                 <w:b w:val="0"/>
+                <w:color w:val="111827"/>
                 <w:sz w:val="18"/>
               </w:rPr>
-              <w:t>负责文件</w:t>
+              <w:t>责任范围</w:t>
             </w:r>
           </w:p>
         </w:tc>
         <w:tc>
           <w:tcPr>
-            <w:tcW w:type="dxa" w:w="6633"/>
+            <w:tcW w:type="dxa" w:w="6803"/>
             <w:vAlign w:val="center"/>
           </w:tcPr>
           <w:p>
             <w:pPr>
-              <w:spacing w:before="0" w:after="40" w:line="276" w:lineRule="auto"/>
-              <w:jc w:val="left"/>
+              <w:spacing w:after="40"/>
             </w:pPr>
-            <w:r/>
             <w:r>
               <w:rPr>
                 <w:rFonts w:ascii="微软雅黑" w:hAnsi="微软雅黑" w:eastAsia="微软雅黑"/>
                 <w:b w:val="0"/>
+                <w:color w:val="111827"/>
                 <w:sz w:val="18"/>
               </w:rPr>
-              <w:t>src/food.c</w:t>
-              <w:br/>
-              <w:t>src/food.h</w:t>
+              <w:t>鼠标按钮、右侧信息面板、暂停/结束弹窗、文字适配和构建脚本。</w:t>
             </w:r>
           </w:p>
         </w:tc>
@@ -2118,87 +1725,41 @@
       <w:tr>
         <w:tc>
           <w:tcPr>
-            <w:tcW w:type="dxa" w:w="1587"/>
+            <w:tcW w:type="dxa" w:w="1701"/>
             <w:vAlign w:val="center"/>
           </w:tcPr>
           <w:p>
             <w:pPr>
-              <w:spacing w:before="0" w:after="40" w:line="276" w:lineRule="auto"/>
-              <w:jc w:val="left"/>
+              <w:spacing w:after="40"/>
             </w:pPr>
-            <w:r/>
             <w:r>
               <w:rPr>
                 <w:rFonts w:ascii="微软雅黑" w:hAnsi="微软雅黑" w:eastAsia="微软雅黑"/>
                 <w:b w:val="0"/>
+                <w:color w:val="111827"/>
                 <w:sz w:val="18"/>
               </w:rPr>
-              <w:t>模块目标</w:t>
+              <w:t>主要函数</w:t>
             </w:r>
           </w:p>
         </w:tc>
         <w:tc>
           <w:tcPr>
-            <w:tcW w:type="dxa" w:w="6633"/>
+            <w:tcW w:type="dxa" w:w="6803"/>
             <w:vAlign w:val="center"/>
           </w:tcPr>
           <w:p>
             <w:pPr>
-              <w:spacing w:before="0" w:after="40" w:line="276" w:lineRule="auto"/>
-              <w:jc w:val="left"/>
+              <w:spacing w:after="40"/>
             </w:pPr>
-            <w:r/>
             <w:r>
               <w:rPr>
                 <w:rFonts w:ascii="微软雅黑" w:hAnsi="微软雅黑" w:eastAsia="微软雅黑"/>
                 <w:b w:val="0"/>
+                <w:color w:val="111827"/>
                 <w:sz w:val="18"/>
               </w:rPr>
-              <w:t>负责食物随机刷新、避免与蛇身重合、吃食物判断、加分、等级和速度变化。</w:t>
-            </w:r>
-          </w:p>
-        </w:tc>
-      </w:tr>
-      <w:tr>
-        <w:tc>
-          <w:tcPr>
-            <w:tcW w:type="dxa" w:w="1587"/>
-            <w:vAlign w:val="center"/>
-          </w:tcPr>
-          <w:p>
-            <w:pPr>
-              <w:spacing w:before="0" w:after="40" w:line="276" w:lineRule="auto"/>
-              <w:jc w:val="left"/>
-            </w:pPr>
-            <w:r/>
-            <w:r>
-              <w:rPr>
-                <w:rFonts w:ascii="微软雅黑" w:hAnsi="微软雅黑" w:eastAsia="微软雅黑"/>
-                <w:b w:val="0"/>
-                <w:sz w:val="18"/>
-              </w:rPr>
-              <w:t>交付标准</w:t>
-            </w:r>
-          </w:p>
-        </w:tc>
-        <w:tc>
-          <w:tcPr>
-            <w:tcW w:type="dxa" w:w="6633"/>
-            <w:vAlign w:val="center"/>
-          </w:tcPr>
-          <w:p>
-            <w:pPr>
-              <w:spacing w:before="0" w:after="40" w:line="276" w:lineRule="auto"/>
-              <w:jc w:val="left"/>
-            </w:pPr>
-            <w:r/>
-            <w:r>
-              <w:rPr>
-                <w:rFonts w:ascii="微软雅黑" w:hAnsi="微软雅黑" w:eastAsia="微软雅黑"/>
-                <w:b w:val="0"/>
-                <w:sz w:val="18"/>
-              </w:rPr>
-              <w:t>食物能随机出现在有效地图位置，不能刷在蛇身上；吃到食物后分数增加，等级和速度按规则变化。</w:t>
+              <w:t>HandleButtons, ActivateButton, DrawSidePanel, DrawButton, DrawOverlay, DrawTextFit, ButtonLabel, build.bat, CMakeLists.txt</w:t>
             </w:r>
           </w:p>
         </w:tc>
@@ -2207,1409 +1768,244 @@
     <w:p/>
     <w:p>
       <w:pPr>
-        <w:pStyle w:val="Heading2"/>
-        <w:spacing w:before="100" w:after="100"/>
+        <w:spacing w:line="300" w:lineRule="auto" w:after="120"/>
+      </w:pPr>
+      <w:r>
+        <w:rPr>
+          <w:rFonts w:ascii="微软雅黑" w:hAnsi="微软雅黑" w:eastAsia="微软雅黑"/>
+          <w:b w:val="0"/>
+          <w:color w:val="111827"/>
+          <w:sz w:val="21"/>
+        </w:rPr>
+        <w:t>详细步骤：</w:t>
+      </w:r>
+    </w:p>
+    <w:p>
+      <w:pPr>
+        <w:spacing w:line="300" w:lineRule="auto" w:after="120"/>
+      </w:pPr>
+      <w:r>
+        <w:rPr>
+          <w:rFonts w:ascii="微软雅黑" w:hAnsi="微软雅黑" w:eastAsia="微软雅黑"/>
+          <w:b w:val="0"/>
+          <w:color w:val="111827"/>
+          <w:sz w:val="21"/>
+        </w:rPr>
+        <w:t>1. 维护 Start、Pause、Restart 按钮的 hover 和 pressed 状态。</w:t>
+      </w:r>
+    </w:p>
+    <w:p>
+      <w:pPr>
+        <w:spacing w:line="300" w:lineRule="auto" w:after="120"/>
+      </w:pPr>
+      <w:r>
+        <w:rPr>
+          <w:rFonts w:ascii="微软雅黑" w:hAnsi="微软雅黑" w:eastAsia="微软雅黑"/>
+          <w:b w:val="0"/>
+          <w:color w:val="111827"/>
+          <w:sz w:val="21"/>
+        </w:rPr>
+        <w:t>2. 绘制分数、最高分、等级、速度和状态面板。</w:t>
+      </w:r>
+    </w:p>
+    <w:p>
+      <w:pPr>
+        <w:spacing w:line="300" w:lineRule="auto" w:after="120"/>
+      </w:pPr>
+      <w:r>
+        <w:rPr>
+          <w:rFonts w:ascii="微软雅黑" w:hAnsi="微软雅黑" w:eastAsia="微软雅黑"/>
+          <w:b w:val="0"/>
+          <w:color w:val="111827"/>
+          <w:sz w:val="21"/>
+        </w:rPr>
+        <w:t>3. 暂停和游戏结束时绘制半透明覆盖层弹窗。</w:t>
+      </w:r>
+    </w:p>
+    <w:p>
+      <w:pPr>
+        <w:spacing w:line="300" w:lineRule="auto" w:after="120"/>
+      </w:pPr>
+      <w:r>
+        <w:rPr>
+          <w:rFonts w:ascii="微软雅黑" w:hAnsi="微软雅黑" w:eastAsia="微软雅黑"/>
+          <w:b w:val="0"/>
+          <w:color w:val="111827"/>
+          <w:sz w:val="21"/>
+        </w:rPr>
+        <w:t>4. 保证 build.bat 默认使用 D:\raylib。</w:t>
+      </w:r>
+    </w:p>
+    <w:p>
+      <w:pPr>
+        <w:spacing w:line="300" w:lineRule="auto" w:after="120"/>
+      </w:pPr>
+      <w:r>
+        <w:rPr>
+          <w:rFonts w:ascii="微软雅黑" w:hAnsi="微软雅黑" w:eastAsia="微软雅黑"/>
+          <w:b w:val="0"/>
+          <w:color w:val="111827"/>
+          <w:sz w:val="21"/>
+        </w:rPr>
+        <w:t>5. 在 README 中维护正确编译和运行说明。</w:t>
+      </w:r>
+    </w:p>
+    <w:p>
+      <w:pPr>
+        <w:spacing w:line="300" w:lineRule="auto" w:after="120"/>
+      </w:pPr>
+      <w:r>
+        <w:rPr>
+          <w:rFonts w:ascii="微软雅黑" w:hAnsi="微软雅黑" w:eastAsia="微软雅黑"/>
+          <w:b w:val="0"/>
+          <w:color w:val="111827"/>
+          <w:sz w:val="21"/>
+        </w:rPr>
+        <w:t>自测重点：</w:t>
+      </w:r>
+    </w:p>
+    <w:p>
+      <w:pPr>
+        <w:spacing w:line="300" w:lineRule="auto" w:after="80"/>
+        <w:ind w:left="369" w:hanging="198"/>
+      </w:pPr>
+      <w:r>
+        <w:rPr>
+          <w:rFonts w:ascii="微软雅黑" w:hAnsi="微软雅黑" w:eastAsia="微软雅黑"/>
+          <w:b w:val="0"/>
+          <w:color w:val="111827"/>
+          <w:sz w:val="21"/>
+        </w:rPr>
+        <w:t>• 按钮可鼠标点击。</w:t>
+      </w:r>
+    </w:p>
+    <w:p>
+      <w:pPr>
+        <w:spacing w:line="300" w:lineRule="auto" w:after="80"/>
+        <w:ind w:left="369" w:hanging="198"/>
+      </w:pPr>
+      <w:r>
+        <w:rPr>
+          <w:rFonts w:ascii="微软雅黑" w:hAnsi="微软雅黑" w:eastAsia="微软雅黑"/>
+          <w:b w:val="0"/>
+          <w:color w:val="111827"/>
+          <w:sz w:val="21"/>
+        </w:rPr>
+        <w:t>• 弹窗文字和按钮不重叠。</w:t>
+      </w:r>
+    </w:p>
+    <w:p>
+      <w:pPr>
+        <w:spacing w:line="300" w:lineRule="auto" w:after="80"/>
+        <w:ind w:left="369" w:hanging="198"/>
+      </w:pPr>
+      <w:r>
+        <w:rPr>
+          <w:rFonts w:ascii="微软雅黑" w:hAnsi="微软雅黑" w:eastAsia="微软雅黑"/>
+          <w:b w:val="0"/>
+          <w:color w:val="111827"/>
+          <w:sz w:val="21"/>
+        </w:rPr>
+        <w:t>• README 命令能编译运行。</w:t>
+      </w:r>
+    </w:p>
+    <w:p>
+      <w:pPr>
+        <w:spacing w:before="280" w:after="120"/>
       </w:pPr>
       <w:r>
         <w:rPr>
           <w:rFonts w:ascii="微软雅黑" w:hAnsi="微软雅黑" w:eastAsia="微软雅黑"/>
           <w:b/>
-          <w:color w:val="374151"/>
-          <w:sz w:val="25"/>
+          <w:color w:val="2E74B5"/>
+          <w:sz w:val="32"/>
         </w:rPr>
-        <w:t>详细实施步骤</w:t>
+        <w:t>八、提交前最终检查清单</w:t>
       </w:r>
     </w:p>
     <w:p>
       <w:pPr>
-        <w:spacing w:line="288" w:lineRule="auto" w:after="40"/>
-        <w:ind w:left="454" w:hanging="283"/>
-      </w:pPr>
-      <w:r>
-        <w:rPr>
-          <w:rFonts w:ascii="微软雅黑" w:hAnsi="微软雅黑" w:eastAsia="微软雅黑"/>
-          <w:sz w:val="20"/>
-        </w:rPr>
-        <w:t>1. 阅读 config.h 中 BOARD_WIDTH、BOARD_HEIGHT、POINTS_PER_FOOD、LEVEL_SCORE_STEP、SPEED_STEP_MS 等常量。</w:t>
-      </w:r>
-    </w:p>
-    <w:p>
-      <w:pPr>
-        <w:spacing w:line="288" w:lineRule="auto" w:after="40"/>
-        <w:ind w:left="454" w:hanging="283"/>
-      </w:pPr>
-      <w:r>
-        <w:rPr>
-          <w:rFonts w:ascii="微软雅黑" w:hAnsi="微软雅黑" w:eastAsia="微软雅黑"/>
-          <w:sz w:val="20"/>
-        </w:rPr>
-        <w:t>2. 完善 food_spawn：用 rand() 在地图范围内生成 x、y 坐标。</w:t>
-      </w:r>
-    </w:p>
-    <w:p>
-      <w:pPr>
-        <w:spacing w:line="288" w:lineRule="auto" w:after="40"/>
-        <w:ind w:left="454" w:hanging="283"/>
-      </w:pPr>
-      <w:r>
-        <w:rPr>
-          <w:rFonts w:ascii="微软雅黑" w:hAnsi="微软雅黑" w:eastAsia="微软雅黑"/>
-          <w:sz w:val="20"/>
-        </w:rPr>
-        <w:t>3. 调用 snake_contains_point 判断生成点是否在蛇身上；如果重合就重新生成，直到位置合法。</w:t>
-      </w:r>
-    </w:p>
-    <w:p>
-      <w:pPr>
-        <w:spacing w:line="288" w:lineRule="auto" w:after="40"/>
-        <w:ind w:left="454" w:hanging="283"/>
-      </w:pPr>
-      <w:r>
-        <w:rPr>
-          <w:rFonts w:ascii="微软雅黑" w:hAnsi="微软雅黑" w:eastAsia="微软雅黑"/>
-          <w:sz w:val="20"/>
-        </w:rPr>
-        <w:t>4. 处理特殊情况：当蛇身长度达到 MAX_CELLS 时，将 food 坐标设置为无效值，交给胜利判断处理。</w:t>
-      </w:r>
-    </w:p>
-    <w:p>
-      <w:pPr>
-        <w:spacing w:line="288" w:lineRule="auto" w:after="40"/>
-        <w:ind w:left="454" w:hanging="283"/>
-      </w:pPr>
-      <w:r>
-        <w:rPr>
-          <w:rFonts w:ascii="微软雅黑" w:hAnsi="微软雅黑" w:eastAsia="微软雅黑"/>
-          <w:sz w:val="20"/>
-        </w:rPr>
-        <w:t>5. 完善 food_is_eaten：判断蛇头坐标是否等于食物坐标。</w:t>
-      </w:r>
-    </w:p>
-    <w:p>
-      <w:pPr>
-        <w:spacing w:line="288" w:lineRule="auto" w:after="40"/>
-        <w:ind w:left="454" w:hanging="283"/>
-      </w:pPr>
-      <w:r>
-        <w:rPr>
-          <w:rFonts w:ascii="微软雅黑" w:hAnsi="微软雅黑" w:eastAsia="微软雅黑"/>
-          <w:sz w:val="20"/>
-        </w:rPr>
-        <w:t>6. 完善 food_apply_score：每吃一次食物增加 POINTS_PER_FOOD 分。</w:t>
-      </w:r>
-    </w:p>
-    <w:p>
-      <w:pPr>
-        <w:spacing w:line="288" w:lineRule="auto" w:after="40"/>
-        <w:ind w:left="454" w:hanging="283"/>
-      </w:pPr>
-      <w:r>
-        <w:rPr>
-          <w:rFonts w:ascii="微软雅黑" w:hAnsi="微软雅黑" w:eastAsia="微软雅黑"/>
-          <w:sz w:val="20"/>
-        </w:rPr>
-        <w:t>7. 根据分数更新等级，并在升级时减少 speed_ms，但不能低于 MIN_SPEED_MS。</w:t>
-      </w:r>
-    </w:p>
-    <w:p>
-      <w:pPr>
-        <w:pStyle w:val="Heading2"/>
-        <w:spacing w:before="100" w:after="100"/>
-      </w:pPr>
-      <w:r>
-        <w:rPr>
-          <w:rFonts w:ascii="微软雅黑" w:hAnsi="微软雅黑" w:eastAsia="微软雅黑"/>
-          <w:b/>
-          <w:color w:val="374151"/>
-          <w:sz w:val="25"/>
-        </w:rPr>
-        <w:t>自测重点</w:t>
-      </w:r>
-    </w:p>
-    <w:p>
-      <w:pPr>
-        <w:spacing w:line="288" w:lineRule="auto" w:after="40"/>
+        <w:spacing w:line="300" w:lineRule="auto" w:after="80"/>
         <w:ind w:left="369" w:hanging="198"/>
       </w:pPr>
       <w:r>
         <w:rPr>
           <w:rFonts w:ascii="微软雅黑" w:hAnsi="微软雅黑" w:eastAsia="微软雅黑"/>
+          <w:b w:val="0"/>
+          <w:color w:val="111827"/>
           <w:sz w:val="21"/>
         </w:rPr>
-        <w:t>• 食物坐标始终在地图内部。</w:t>
+        <w:t>• 源码能通过 gcc 编译。</w:t>
       </w:r>
     </w:p>
     <w:p>
       <w:pPr>
-        <w:spacing w:line="288" w:lineRule="auto" w:after="40"/>
+        <w:spacing w:line="300" w:lineRule="auto" w:after="80"/>
         <w:ind w:left="369" w:hanging="198"/>
       </w:pPr>
       <w:r>
         <w:rPr>
           <w:rFonts w:ascii="微软雅黑" w:hAnsi="微软雅黑" w:eastAsia="微软雅黑"/>
+          <w:b w:val="0"/>
+          <w:color w:val="111827"/>
           <w:sz w:val="21"/>
         </w:rPr>
-        <w:t>• 食物不会生成在蛇头或蛇身上。</w:t>
+        <w:t>• 不要提交 snake_raylib.exe、build/ 或最高分数据文件。</w:t>
       </w:r>
     </w:p>
     <w:p>
       <w:pPr>
-        <w:spacing w:line="288" w:lineRule="auto" w:after="40"/>
+        <w:spacing w:line="300" w:lineRule="auto" w:after="80"/>
         <w:ind w:left="369" w:hanging="198"/>
       </w:pPr>
       <w:r>
         <w:rPr>
           <w:rFonts w:ascii="微软雅黑" w:hAnsi="微软雅黑" w:eastAsia="微软雅黑"/>
+          <w:b w:val="0"/>
+          <w:color w:val="111827"/>
           <w:sz w:val="21"/>
         </w:rPr>
-        <w:t>• 蛇头碰到食物时 food_is_eaten 返回真。</w:t>
+        <w:t>• README、TASKS、CONTRIBUTING 与当前 raylib 版本一致。</w:t>
       </w:r>
     </w:p>
     <w:p>
       <w:pPr>
-        <w:spacing w:line="288" w:lineRule="auto" w:after="40"/>
+        <w:spacing w:line="300" w:lineRule="auto" w:after="80"/>
         <w:ind w:left="369" w:hanging="198"/>
       </w:pPr>
       <w:r>
         <w:rPr>
           <w:rFonts w:ascii="微软雅黑" w:hAnsi="微软雅黑" w:eastAsia="微软雅黑"/>
+          <w:b w:val="0"/>
+          <w:color w:val="111827"/>
           <w:sz w:val="21"/>
         </w:rPr>
-        <w:t>• 吃食物后分数正确增加。</w:t>
+        <w:t>• 每个成员都能在报告中说明自己负责的函数和代码逻辑。</w:t>
       </w:r>
     </w:p>
     <w:p>
       <w:pPr>
-        <w:spacing w:line="288" w:lineRule="auto" w:after="40"/>
+        <w:spacing w:line="300" w:lineRule="auto" w:after="80"/>
         <w:ind w:left="369" w:hanging="198"/>
       </w:pPr>
       <w:r>
         <w:rPr>
           <w:rFonts w:ascii="微软雅黑" w:hAnsi="微软雅黑" w:eastAsia="微软雅黑"/>
+          <w:b w:val="0"/>
+          <w:color w:val="111827"/>
           <w:sz w:val="21"/>
         </w:rPr>
-        <w:t>• 达到升级分数后等级提升、速度变快，并且速度不会低于最低值。</w:t>
+        <w:t>• 演示时能完成开始、移动、吃食物、暂停、重开和游戏结束流程。</w:t>
       </w:r>
     </w:p>
-    <w:p>
-      <w:pPr>
-        <w:pStyle w:val="Heading2"/>
-        <w:spacing w:before="100" w:after="100"/>
-      </w:pPr>
-      <w:r>
-        <w:rPr>
-          <w:rFonts w:ascii="微软雅黑" w:hAnsi="微软雅黑" w:eastAsia="微软雅黑"/>
-          <w:b/>
-          <w:color w:val="374151"/>
-          <w:sz w:val="25"/>
-        </w:rPr>
-        <w:t>建议提交命令</w:t>
-      </w:r>
-    </w:p>
-    <w:tbl>
-      <w:tblPr>
-        <w:tblStyle w:val="TableGrid"/>
-        <w:tblW w:type="auto" w:w="0"/>
-        <w:jc w:val="center"/>
-        <w:tblLook w:firstColumn="1" w:firstRow="1" w:lastColumn="0" w:lastRow="0" w:noHBand="0" w:noVBand="1" w:val="04A0"/>
-      </w:tblPr>
-      <w:tblGrid>
-        <w:gridCol w:w="9858"/>
-      </w:tblGrid>
-      <w:tr>
-        <w:tc>
-          <w:tcPr>
-            <w:tcW w:type="dxa" w:w="9858"/>
-            <w:shd w:fill="F3F4F6"/>
-            <w:vAlign w:val="center"/>
-          </w:tcPr>
-          <w:p>
-            <w:pPr>
-              <w:spacing w:before="40" w:after="40"/>
-            </w:pPr>
-            <w:r>
-              <w:rPr>
-                <w:rFonts w:ascii="Consolas" w:hAnsi="Consolas" w:eastAsia="Consolas"/>
-                <w:color w:val="111827"/>
-                <w:sz w:val="18"/>
-              </w:rPr>
-              <w:t>git add src\food.c src\food.h</w:t>
-            </w:r>
-            <w:r>
-              <w:br/>
-            </w:r>
-            <w:r>
-              <w:rPr>
-                <w:rFonts w:ascii="Consolas" w:hAnsi="Consolas" w:eastAsia="Consolas"/>
-                <w:color w:val="111827"/>
-                <w:sz w:val="18"/>
-              </w:rPr>
-              <w:t>git commit -m "完成食物生成和计分难度模块"</w:t>
-            </w:r>
-            <w:r>
-              <w:br/>
-            </w:r>
-            <w:r>
-              <w:rPr>
-                <w:rFonts w:ascii="Consolas" w:hAnsi="Consolas" w:eastAsia="Consolas"/>
-                <w:color w:val="111827"/>
-                <w:sz w:val="18"/>
-              </w:rPr>
-              <w:t>git push origin main</w:t>
-            </w:r>
-          </w:p>
-        </w:tc>
-      </w:tr>
-    </w:tbl>
-    <w:p/>
-    <w:p>
-      <w:r>
-        <w:br w:type="page"/>
-      </w:r>
-    </w:p>
-    <w:p>
-      <w:pPr>
-        <w:pStyle w:val="Heading1"/>
-        <w:spacing w:before="160" w:after="100"/>
-      </w:pPr>
-      <w:r>
-        <w:rPr>
-          <w:rFonts w:ascii="微软雅黑" w:hAnsi="微软雅黑" w:eastAsia="微软雅黑"/>
-          <w:b/>
-          <w:color w:val="0F766E"/>
-          <w:sz w:val="32"/>
-        </w:rPr>
-        <w:t>五、成员4：碰撞检测与胜负判断</w:t>
-      </w:r>
-    </w:p>
-    <w:tbl>
-      <w:tblPr>
-        <w:tblStyle w:val="TableGrid"/>
-        <w:tblW w:type="auto" w:w="0"/>
-        <w:jc w:val="center"/>
-        <w:tblLook w:firstColumn="1" w:firstRow="1" w:lastColumn="0" w:lastRow="0" w:noHBand="0" w:noVBand="1" w:val="04A0"/>
-      </w:tblPr>
-      <w:tblGrid>
-        <w:gridCol w:w="4929"/>
-        <w:gridCol w:w="4929"/>
-      </w:tblGrid>
-      <w:tr>
-        <w:tc>
-          <w:tcPr>
-            <w:tcW w:type="dxa" w:w="1587"/>
-            <w:vAlign w:val="center"/>
-            <w:shd w:fill="0F766E"/>
-          </w:tcPr>
-          <w:p>
-            <w:pPr>
-              <w:spacing w:before="0" w:after="40" w:line="276" w:lineRule="auto"/>
-              <w:jc w:val="center"/>
-            </w:pPr>
-            <w:r/>
-            <w:r>
-              <w:rPr>
-                <w:rFonts w:ascii="微软雅黑" w:hAnsi="微软雅黑" w:eastAsia="微软雅黑"/>
-                <w:b/>
-                <w:color w:val="FFFFFF"/>
-                <w:sz w:val="19"/>
-              </w:rPr>
-              <w:t>项目</w:t>
-            </w:r>
-          </w:p>
-        </w:tc>
-        <w:tc>
-          <w:tcPr>
-            <w:tcW w:type="dxa" w:w="6633"/>
-            <w:vAlign w:val="center"/>
-            <w:shd w:fill="0F766E"/>
-          </w:tcPr>
-          <w:p>
-            <w:pPr>
-              <w:spacing w:before="0" w:after="40" w:line="276" w:lineRule="auto"/>
-              <w:jc w:val="center"/>
-            </w:pPr>
-            <w:r/>
-            <w:r>
-              <w:rPr>
-                <w:rFonts w:ascii="微软雅黑" w:hAnsi="微软雅黑" w:eastAsia="微软雅黑"/>
-                <w:b/>
-                <w:color w:val="FFFFFF"/>
-                <w:sz w:val="19"/>
-              </w:rPr>
-              <w:t>内容</w:t>
-            </w:r>
-          </w:p>
-        </w:tc>
-      </w:tr>
-      <w:tr>
-        <w:tc>
-          <w:tcPr>
-            <w:tcW w:type="dxa" w:w="1587"/>
-            <w:vAlign w:val="center"/>
-          </w:tcPr>
-          <w:p>
-            <w:pPr>
-              <w:spacing w:before="0" w:after="40" w:line="276" w:lineRule="auto"/>
-              <w:jc w:val="left"/>
-            </w:pPr>
-            <w:r/>
-            <w:r>
-              <w:rPr>
-                <w:rFonts w:ascii="微软雅黑" w:hAnsi="微软雅黑" w:eastAsia="微软雅黑"/>
-                <w:b w:val="0"/>
-                <w:sz w:val="18"/>
-              </w:rPr>
-              <w:t>负责文件</w:t>
-            </w:r>
-          </w:p>
-        </w:tc>
-        <w:tc>
-          <w:tcPr>
-            <w:tcW w:type="dxa" w:w="6633"/>
-            <w:vAlign w:val="center"/>
-          </w:tcPr>
-          <w:p>
-            <w:pPr>
-              <w:spacing w:before="0" w:after="40" w:line="276" w:lineRule="auto"/>
-              <w:jc w:val="left"/>
-            </w:pPr>
-            <w:r/>
-            <w:r>
-              <w:rPr>
-                <w:rFonts w:ascii="微软雅黑" w:hAnsi="微软雅黑" w:eastAsia="微软雅黑"/>
-                <w:b w:val="0"/>
-                <w:sz w:val="18"/>
-              </w:rPr>
-              <w:t>src/collision.c</w:t>
-              <w:br/>
-              <w:t>src/collision.h</w:t>
-            </w:r>
-          </w:p>
-        </w:tc>
-      </w:tr>
-      <w:tr>
-        <w:tc>
-          <w:tcPr>
-            <w:tcW w:type="dxa" w:w="1587"/>
-            <w:vAlign w:val="center"/>
-          </w:tcPr>
-          <w:p>
-            <w:pPr>
-              <w:spacing w:before="0" w:after="40" w:line="276" w:lineRule="auto"/>
-              <w:jc w:val="left"/>
-            </w:pPr>
-            <w:r/>
-            <w:r>
-              <w:rPr>
-                <w:rFonts w:ascii="微软雅黑" w:hAnsi="微软雅黑" w:eastAsia="微软雅黑"/>
-                <w:b w:val="0"/>
-                <w:sz w:val="18"/>
-              </w:rPr>
-              <w:t>模块目标</w:t>
-            </w:r>
-          </w:p>
-        </w:tc>
-        <w:tc>
-          <w:tcPr>
-            <w:tcW w:type="dxa" w:w="6633"/>
-            <w:vAlign w:val="center"/>
-          </w:tcPr>
-          <w:p>
-            <w:pPr>
-              <w:spacing w:before="0" w:after="40" w:line="276" w:lineRule="auto"/>
-              <w:jc w:val="left"/>
-            </w:pPr>
-            <w:r/>
-            <w:r>
-              <w:rPr>
-                <w:rFonts w:ascii="微软雅黑" w:hAnsi="微软雅黑" w:eastAsia="微软雅黑"/>
-                <w:b w:val="0"/>
-                <w:sz w:val="18"/>
-              </w:rPr>
-              <w:t>负责判断蛇是否撞墙、撞到自身，以及游戏是否失败或胜利。</w:t>
-            </w:r>
-          </w:p>
-        </w:tc>
-      </w:tr>
-      <w:tr>
-        <w:tc>
-          <w:tcPr>
-            <w:tcW w:type="dxa" w:w="1587"/>
-            <w:vAlign w:val="center"/>
-          </w:tcPr>
-          <w:p>
-            <w:pPr>
-              <w:spacing w:before="0" w:after="40" w:line="276" w:lineRule="auto"/>
-              <w:jc w:val="left"/>
-            </w:pPr>
-            <w:r/>
-            <w:r>
-              <w:rPr>
-                <w:rFonts w:ascii="微软雅黑" w:hAnsi="微软雅黑" w:eastAsia="微软雅黑"/>
-                <w:b w:val="0"/>
-                <w:sz w:val="18"/>
-              </w:rPr>
-              <w:t>交付标准</w:t>
-            </w:r>
-          </w:p>
-        </w:tc>
-        <w:tc>
-          <w:tcPr>
-            <w:tcW w:type="dxa" w:w="6633"/>
-            <w:vAlign w:val="center"/>
-          </w:tcPr>
-          <w:p>
-            <w:pPr>
-              <w:spacing w:before="0" w:after="40" w:line="276" w:lineRule="auto"/>
-              <w:jc w:val="left"/>
-            </w:pPr>
-            <w:r/>
-            <w:r>
-              <w:rPr>
-                <w:rFonts w:ascii="微软雅黑" w:hAnsi="微软雅黑" w:eastAsia="微软雅黑"/>
-                <w:b w:val="0"/>
-                <w:sz w:val="18"/>
-              </w:rPr>
-              <w:t>碰撞判断准确，不误判正常移动；失败和胜利条件能被成员1的游戏流程正确使用。</w:t>
-            </w:r>
-          </w:p>
-        </w:tc>
-      </w:tr>
-    </w:tbl>
-    <w:p/>
-    <w:p>
-      <w:pPr>
-        <w:pStyle w:val="Heading2"/>
-        <w:spacing w:before="100" w:after="100"/>
-      </w:pPr>
-      <w:r>
-        <w:rPr>
-          <w:rFonts w:ascii="微软雅黑" w:hAnsi="微软雅黑" w:eastAsia="微软雅黑"/>
-          <w:b/>
-          <w:color w:val="374151"/>
-          <w:sz w:val="25"/>
-        </w:rPr>
-        <w:t>详细实施步骤</w:t>
-      </w:r>
-    </w:p>
-    <w:p>
-      <w:pPr>
-        <w:spacing w:line="288" w:lineRule="auto" w:after="40"/>
-        <w:ind w:left="454" w:hanging="283"/>
-      </w:pPr>
-      <w:r>
-        <w:rPr>
-          <w:rFonts w:ascii="微软雅黑" w:hAnsi="微软雅黑" w:eastAsia="微软雅黑"/>
-          <w:sz w:val="20"/>
-        </w:rPr>
-        <w:t>1. 完善 collision_hits_wall：当蛇头 x 小于 0、x 大于等于 BOARD_WIDTH、y 小于 0、y 大于等于 BOARD_HEIGHT 时返回真。</w:t>
-      </w:r>
-    </w:p>
-    <w:p>
-      <w:pPr>
-        <w:spacing w:line="288" w:lineRule="auto" w:after="40"/>
-        <w:ind w:left="454" w:hanging="283"/>
-      </w:pPr>
-      <w:r>
-        <w:rPr>
-          <w:rFonts w:ascii="微软雅黑" w:hAnsi="微软雅黑" w:eastAsia="微软雅黑"/>
-          <w:sz w:val="20"/>
-        </w:rPr>
-        <w:t>2. 完善 collision_hits_self：遍历蛇身坐标，判断下一步蛇头是否和蛇身重合。</w:t>
-      </w:r>
-    </w:p>
-    <w:p>
-      <w:pPr>
-        <w:spacing w:line="288" w:lineRule="auto" w:after="40"/>
-        <w:ind w:left="454" w:hanging="283"/>
-      </w:pPr>
-      <w:r>
-        <w:rPr>
-          <w:rFonts w:ascii="微软雅黑" w:hAnsi="微软雅黑" w:eastAsia="微软雅黑"/>
-          <w:sz w:val="20"/>
-        </w:rPr>
-        <w:t>3. 注意普通移动时尾巴会离开原位置；如果 grow 为假，可以不把当前尾巴位置算作碰撞。</w:t>
-      </w:r>
-    </w:p>
-    <w:p>
-      <w:pPr>
-        <w:spacing w:line="288" w:lineRule="auto" w:after="40"/>
-        <w:ind w:left="454" w:hanging="283"/>
-      </w:pPr>
-      <w:r>
-        <w:rPr>
-          <w:rFonts w:ascii="微软雅黑" w:hAnsi="微软雅黑" w:eastAsia="微软雅黑"/>
-          <w:sz w:val="20"/>
-        </w:rPr>
-        <w:t>4. 如果 grow 为真，尾巴不会离开，此时撞到任何蛇身位置都应算碰撞。</w:t>
-      </w:r>
-    </w:p>
-    <w:p>
-      <w:pPr>
-        <w:spacing w:line="288" w:lineRule="auto" w:after="40"/>
-        <w:ind w:left="454" w:hanging="283"/>
-      </w:pPr>
-      <w:r>
-        <w:rPr>
-          <w:rFonts w:ascii="微软雅黑" w:hAnsi="微软雅黑" w:eastAsia="微软雅黑"/>
-          <w:sz w:val="20"/>
-        </w:rPr>
-        <w:t>5. 完善 collision_is_victory：当蛇身长度达到 MAX_CELLS，说明地图被填满，返回胜利。</w:t>
-      </w:r>
-    </w:p>
-    <w:p>
-      <w:pPr>
-        <w:spacing w:line="288" w:lineRule="auto" w:after="40"/>
-        <w:ind w:left="454" w:hanging="283"/>
-      </w:pPr>
-      <w:r>
-        <w:rPr>
-          <w:rFonts w:ascii="微软雅黑" w:hAnsi="微软雅黑" w:eastAsia="微软雅黑"/>
-          <w:sz w:val="20"/>
-        </w:rPr>
-        <w:t>6. 和成员1联调，确认碰撞后 game-&gt;status 能正确变为 GAME_OVER 或 GAME_VICTORY。</w:t>
-      </w:r>
-    </w:p>
-    <w:p>
-      <w:pPr>
-        <w:pStyle w:val="Heading2"/>
-        <w:spacing w:before="100" w:after="100"/>
-      </w:pPr>
-      <w:r>
-        <w:rPr>
-          <w:rFonts w:ascii="微软雅黑" w:hAnsi="微软雅黑" w:eastAsia="微软雅黑"/>
-          <w:b/>
-          <w:color w:val="374151"/>
-          <w:sz w:val="25"/>
-        </w:rPr>
-        <w:t>自测重点</w:t>
-      </w:r>
-    </w:p>
-    <w:p>
-      <w:pPr>
-        <w:spacing w:line="288" w:lineRule="auto" w:after="40"/>
-        <w:ind w:left="369" w:hanging="198"/>
-      </w:pPr>
-      <w:r>
-        <w:rPr>
-          <w:rFonts w:ascii="微软雅黑" w:hAnsi="微软雅黑" w:eastAsia="微软雅黑"/>
-          <w:sz w:val="21"/>
-        </w:rPr>
-        <w:t>• 蛇头越过上、下、左、右边界都会失败。</w:t>
-      </w:r>
-    </w:p>
-    <w:p>
-      <w:pPr>
-        <w:spacing w:line="288" w:lineRule="auto" w:after="40"/>
-        <w:ind w:left="369" w:hanging="198"/>
-      </w:pPr>
-      <w:r>
-        <w:rPr>
-          <w:rFonts w:ascii="微软雅黑" w:hAnsi="微软雅黑" w:eastAsia="微软雅黑"/>
-          <w:sz w:val="21"/>
-        </w:rPr>
-        <w:t>• 蛇头撞到自己的身体时失败。</w:t>
-      </w:r>
-    </w:p>
-    <w:p>
-      <w:pPr>
-        <w:spacing w:line="288" w:lineRule="auto" w:after="40"/>
-        <w:ind w:left="369" w:hanging="198"/>
-      </w:pPr>
-      <w:r>
-        <w:rPr>
-          <w:rFonts w:ascii="微软雅黑" w:hAnsi="微软雅黑" w:eastAsia="微软雅黑"/>
-          <w:sz w:val="21"/>
-        </w:rPr>
-        <w:t>• 普通移动到原尾巴位置时不被误判为撞自己。</w:t>
-      </w:r>
-    </w:p>
-    <w:p>
-      <w:pPr>
-        <w:spacing w:line="288" w:lineRule="auto" w:after="40"/>
-        <w:ind w:left="369" w:hanging="198"/>
-      </w:pPr>
-      <w:r>
-        <w:rPr>
-          <w:rFonts w:ascii="微软雅黑" w:hAnsi="微软雅黑" w:eastAsia="微软雅黑"/>
-          <w:sz w:val="21"/>
-        </w:rPr>
-        <w:t>• 吃食物增长时如果撞到身体，应判定失败。</w:t>
-      </w:r>
-    </w:p>
-    <w:p>
-      <w:pPr>
-        <w:spacing w:line="288" w:lineRule="auto" w:after="40"/>
-        <w:ind w:left="369" w:hanging="198"/>
-      </w:pPr>
-      <w:r>
-        <w:rPr>
-          <w:rFonts w:ascii="微软雅黑" w:hAnsi="微软雅黑" w:eastAsia="微软雅黑"/>
-          <w:sz w:val="21"/>
-        </w:rPr>
-        <w:t>• 蛇身占满地图时能触发胜利。</w:t>
-      </w:r>
-    </w:p>
-    <w:p>
-      <w:pPr>
-        <w:pStyle w:val="Heading2"/>
-        <w:spacing w:before="100" w:after="100"/>
-      </w:pPr>
-      <w:r>
-        <w:rPr>
-          <w:rFonts w:ascii="微软雅黑" w:hAnsi="微软雅黑" w:eastAsia="微软雅黑"/>
-          <w:b/>
-          <w:color w:val="374151"/>
-          <w:sz w:val="25"/>
-        </w:rPr>
-        <w:t>建议提交命令</w:t>
-      </w:r>
-    </w:p>
-    <w:tbl>
-      <w:tblPr>
-        <w:tblStyle w:val="TableGrid"/>
-        <w:tblW w:type="auto" w:w="0"/>
-        <w:jc w:val="center"/>
-        <w:tblLook w:firstColumn="1" w:firstRow="1" w:lastColumn="0" w:lastRow="0" w:noHBand="0" w:noVBand="1" w:val="04A0"/>
-      </w:tblPr>
-      <w:tblGrid>
-        <w:gridCol w:w="9858"/>
-      </w:tblGrid>
-      <w:tr>
-        <w:tc>
-          <w:tcPr>
-            <w:tcW w:type="dxa" w:w="9858"/>
-            <w:shd w:fill="F3F4F6"/>
-            <w:vAlign w:val="center"/>
-          </w:tcPr>
-          <w:p>
-            <w:pPr>
-              <w:spacing w:before="40" w:after="40"/>
-            </w:pPr>
-            <w:r>
-              <w:rPr>
-                <w:rFonts w:ascii="Consolas" w:hAnsi="Consolas" w:eastAsia="Consolas"/>
-                <w:color w:val="111827"/>
-                <w:sz w:val="18"/>
-              </w:rPr>
-              <w:t>git add src\collision.c src\collision.h</w:t>
-            </w:r>
-            <w:r>
-              <w:br/>
-            </w:r>
-            <w:r>
-              <w:rPr>
-                <w:rFonts w:ascii="Consolas" w:hAnsi="Consolas" w:eastAsia="Consolas"/>
-                <w:color w:val="111827"/>
-                <w:sz w:val="18"/>
-              </w:rPr>
-              <w:t>git commit -m "完成碰撞检测和胜负判断模块"</w:t>
-            </w:r>
-            <w:r>
-              <w:br/>
-            </w:r>
-            <w:r>
-              <w:rPr>
-                <w:rFonts w:ascii="Consolas" w:hAnsi="Consolas" w:eastAsia="Consolas"/>
-                <w:color w:val="111827"/>
-                <w:sz w:val="18"/>
-              </w:rPr>
-              <w:t>git push origin main</w:t>
-            </w:r>
-          </w:p>
-        </w:tc>
-      </w:tr>
-    </w:tbl>
-    <w:p/>
-    <w:p>
-      <w:r>
-        <w:br w:type="page"/>
-      </w:r>
-    </w:p>
-    <w:p>
-      <w:pPr>
-        <w:pStyle w:val="Heading1"/>
-        <w:spacing w:before="160" w:after="100"/>
-      </w:pPr>
-      <w:r>
-        <w:rPr>
-          <w:rFonts w:ascii="微软雅黑" w:hAnsi="微软雅黑" w:eastAsia="微软雅黑"/>
-          <w:b/>
-          <w:color w:val="0F766E"/>
-          <w:sz w:val="32"/>
-        </w:rPr>
-        <w:t>六、成员5：界面绘制与键盘输入输出</w:t>
-      </w:r>
-    </w:p>
-    <w:tbl>
-      <w:tblPr>
-        <w:tblStyle w:val="TableGrid"/>
-        <w:tblW w:type="auto" w:w="0"/>
-        <w:jc w:val="center"/>
-        <w:tblLook w:firstColumn="1" w:firstRow="1" w:lastColumn="0" w:lastRow="0" w:noHBand="0" w:noVBand="1" w:val="04A0"/>
-      </w:tblPr>
-      <w:tblGrid>
-        <w:gridCol w:w="4929"/>
-        <w:gridCol w:w="4929"/>
-      </w:tblGrid>
-      <w:tr>
-        <w:tc>
-          <w:tcPr>
-            <w:tcW w:type="dxa" w:w="1587"/>
-            <w:vAlign w:val="center"/>
-            <w:shd w:fill="0F766E"/>
-          </w:tcPr>
-          <w:p>
-            <w:pPr>
-              <w:spacing w:before="0" w:after="40" w:line="276" w:lineRule="auto"/>
-              <w:jc w:val="center"/>
-            </w:pPr>
-            <w:r/>
-            <w:r>
-              <w:rPr>
-                <w:rFonts w:ascii="微软雅黑" w:hAnsi="微软雅黑" w:eastAsia="微软雅黑"/>
-                <w:b/>
-                <w:color w:val="FFFFFF"/>
-                <w:sz w:val="19"/>
-              </w:rPr>
-              <w:t>项目</w:t>
-            </w:r>
-          </w:p>
-        </w:tc>
-        <w:tc>
-          <w:tcPr>
-            <w:tcW w:type="dxa" w:w="6633"/>
-            <w:vAlign w:val="center"/>
-            <w:shd w:fill="0F766E"/>
-          </w:tcPr>
-          <w:p>
-            <w:pPr>
-              <w:spacing w:before="0" w:after="40" w:line="276" w:lineRule="auto"/>
-              <w:jc w:val="center"/>
-            </w:pPr>
-            <w:r/>
-            <w:r>
-              <w:rPr>
-                <w:rFonts w:ascii="微软雅黑" w:hAnsi="微软雅黑" w:eastAsia="微软雅黑"/>
-                <w:b/>
-                <w:color w:val="FFFFFF"/>
-                <w:sz w:val="19"/>
-              </w:rPr>
-              <w:t>内容</w:t>
-            </w:r>
-          </w:p>
-        </w:tc>
-      </w:tr>
-      <w:tr>
-        <w:tc>
-          <w:tcPr>
-            <w:tcW w:type="dxa" w:w="1587"/>
-            <w:vAlign w:val="center"/>
-          </w:tcPr>
-          <w:p>
-            <w:pPr>
-              <w:spacing w:before="0" w:after="40" w:line="276" w:lineRule="auto"/>
-              <w:jc w:val="left"/>
-            </w:pPr>
-            <w:r/>
-            <w:r>
-              <w:rPr>
-                <w:rFonts w:ascii="微软雅黑" w:hAnsi="微软雅黑" w:eastAsia="微软雅黑"/>
-                <w:b w:val="0"/>
-                <w:sz w:val="18"/>
-              </w:rPr>
-              <w:t>负责文件</w:t>
-            </w:r>
-          </w:p>
-        </w:tc>
-        <w:tc>
-          <w:tcPr>
-            <w:tcW w:type="dxa" w:w="6633"/>
-            <w:vAlign w:val="center"/>
-          </w:tcPr>
-          <w:p>
-            <w:pPr>
-              <w:spacing w:before="0" w:after="40" w:line="276" w:lineRule="auto"/>
-              <w:jc w:val="left"/>
-            </w:pPr>
-            <w:r/>
-            <w:r>
-              <w:rPr>
-                <w:rFonts w:ascii="微软雅黑" w:hAnsi="微软雅黑" w:eastAsia="微软雅黑"/>
-                <w:b w:val="0"/>
-                <w:sz w:val="18"/>
-              </w:rPr>
-              <w:t>src/ui.c</w:t>
-              <w:br/>
-              <w:t>src/ui.h</w:t>
-            </w:r>
-          </w:p>
-        </w:tc>
-      </w:tr>
-      <w:tr>
-        <w:tc>
-          <w:tcPr>
-            <w:tcW w:type="dxa" w:w="1587"/>
-            <w:vAlign w:val="center"/>
-          </w:tcPr>
-          <w:p>
-            <w:pPr>
-              <w:spacing w:before="0" w:after="40" w:line="276" w:lineRule="auto"/>
-              <w:jc w:val="left"/>
-            </w:pPr>
-            <w:r/>
-            <w:r>
-              <w:rPr>
-                <w:rFonts w:ascii="微软雅黑" w:hAnsi="微软雅黑" w:eastAsia="微软雅黑"/>
-                <w:b w:val="0"/>
-                <w:sz w:val="18"/>
-              </w:rPr>
-              <w:t>模块目标</w:t>
-            </w:r>
-          </w:p>
-        </w:tc>
-        <w:tc>
-          <w:tcPr>
-            <w:tcW w:type="dxa" w:w="6633"/>
-            <w:vAlign w:val="center"/>
-          </w:tcPr>
-          <w:p>
-            <w:pPr>
-              <w:spacing w:before="0" w:after="40" w:line="276" w:lineRule="auto"/>
-              <w:jc w:val="left"/>
-            </w:pPr>
-            <w:r/>
-            <w:r>
-              <w:rPr>
-                <w:rFonts w:ascii="微软雅黑" w:hAnsi="微软雅黑" w:eastAsia="微软雅黑"/>
-                <w:b w:val="0"/>
-                <w:sz w:val="18"/>
-              </w:rPr>
-              <w:t>负责控制台界面显示、键盘输入读取、地图刷新、分数提示和结束界面显示。</w:t>
-            </w:r>
-          </w:p>
-        </w:tc>
-      </w:tr>
-      <w:tr>
-        <w:tc>
-          <w:tcPr>
-            <w:tcW w:type="dxa" w:w="1587"/>
-            <w:vAlign w:val="center"/>
-          </w:tcPr>
-          <w:p>
-            <w:pPr>
-              <w:spacing w:before="0" w:after="40" w:line="276" w:lineRule="auto"/>
-              <w:jc w:val="left"/>
-            </w:pPr>
-            <w:r/>
-            <w:r>
-              <w:rPr>
-                <w:rFonts w:ascii="微软雅黑" w:hAnsi="微软雅黑" w:eastAsia="微软雅黑"/>
-                <w:b w:val="0"/>
-                <w:sz w:val="18"/>
-              </w:rPr>
-              <w:t>交付标准</w:t>
-            </w:r>
-          </w:p>
-        </w:tc>
-        <w:tc>
-          <w:tcPr>
-            <w:tcW w:type="dxa" w:w="6633"/>
-            <w:vAlign w:val="center"/>
-          </w:tcPr>
-          <w:p>
-            <w:pPr>
-              <w:spacing w:before="0" w:after="40" w:line="276" w:lineRule="auto"/>
-              <w:jc w:val="left"/>
-            </w:pPr>
-            <w:r/>
-            <w:r>
-              <w:rPr>
-                <w:rFonts w:ascii="微软雅黑" w:hAnsi="微软雅黑" w:eastAsia="微软雅黑"/>
-                <w:b w:val="0"/>
-                <w:sz w:val="18"/>
-              </w:rPr>
-              <w:t>界面能清楚显示地图、蛇、食物、分数和状态提示；键盘输入能被主程序正确读取。</w:t>
-            </w:r>
-          </w:p>
-        </w:tc>
-      </w:tr>
-    </w:tbl>
-    <w:p/>
-    <w:p>
-      <w:pPr>
-        <w:pStyle w:val="Heading2"/>
-        <w:spacing w:before="100" w:after="100"/>
-      </w:pPr>
-      <w:r>
-        <w:rPr>
-          <w:rFonts w:ascii="微软雅黑" w:hAnsi="微软雅黑" w:eastAsia="微软雅黑"/>
-          <w:b/>
-          <w:color w:val="374151"/>
-          <w:sz w:val="25"/>
-        </w:rPr>
-        <w:t>详细实施步骤</w:t>
-      </w:r>
-    </w:p>
-    <w:p>
-      <w:pPr>
-        <w:spacing w:line="288" w:lineRule="auto" w:after="40"/>
-        <w:ind w:left="454" w:hanging="283"/>
-      </w:pPr>
-      <w:r>
-        <w:rPr>
-          <w:rFonts w:ascii="微软雅黑" w:hAnsi="微软雅黑" w:eastAsia="微软雅黑"/>
-          <w:sz w:val="20"/>
-        </w:rPr>
-        <w:t>1. 完善 ui_setup：设置控制台 UTF-8 编码，必要时隐藏光标，减少刷新闪烁。</w:t>
-      </w:r>
-    </w:p>
-    <w:p>
-      <w:pPr>
-        <w:spacing w:line="288" w:lineRule="auto" w:after="40"/>
-        <w:ind w:left="454" w:hanging="283"/>
-      </w:pPr>
-      <w:r>
-        <w:rPr>
-          <w:rFonts w:ascii="微软雅黑" w:hAnsi="微软雅黑" w:eastAsia="微软雅黑"/>
-          <w:sz w:val="20"/>
-        </w:rPr>
-        <w:t>2. 完善 ui_draw：先清屏，再绘制游戏标题、分数、等级、速度和操作提示。</w:t>
-      </w:r>
-    </w:p>
-    <w:p>
-      <w:pPr>
-        <w:spacing w:line="288" w:lineRule="auto" w:after="40"/>
-        <w:ind w:left="454" w:hanging="283"/>
-      </w:pPr>
-      <w:r>
-        <w:rPr>
-          <w:rFonts w:ascii="微软雅黑" w:hAnsi="微软雅黑" w:eastAsia="微软雅黑"/>
-          <w:sz w:val="20"/>
-        </w:rPr>
-        <w:t>3. 绘制地图边框，地图内部根据坐标显示蛇头、蛇身、食物或空格。</w:t>
-      </w:r>
-    </w:p>
-    <w:p>
-      <w:pPr>
-        <w:spacing w:line="288" w:lineRule="auto" w:after="40"/>
-        <w:ind w:left="454" w:hanging="283"/>
-      </w:pPr>
-      <w:r>
-        <w:rPr>
-          <w:rFonts w:ascii="微软雅黑" w:hAnsi="微软雅黑" w:eastAsia="微软雅黑"/>
-          <w:sz w:val="20"/>
-        </w:rPr>
-        <w:t>4. 建议用 @ 表示蛇头，o 表示蛇身，* 表示食物，# 表示边框。</w:t>
-      </w:r>
-    </w:p>
-    <w:p>
-      <w:pPr>
-        <w:spacing w:line="288" w:lineRule="auto" w:after="40"/>
-        <w:ind w:left="454" w:hanging="283"/>
-      </w:pPr>
-      <w:r>
-        <w:rPr>
-          <w:rFonts w:ascii="微软雅黑" w:hAnsi="微软雅黑" w:eastAsia="微软雅黑"/>
-          <w:sz w:val="20"/>
-        </w:rPr>
-        <w:t>5. 根据 game-&gt;status 显示暂停、失败、胜利等提示信息。</w:t>
-      </w:r>
-    </w:p>
-    <w:p>
-      <w:pPr>
-        <w:spacing w:line="288" w:lineRule="auto" w:after="40"/>
-        <w:ind w:left="454" w:hanging="283"/>
-      </w:pPr>
-      <w:r>
-        <w:rPr>
-          <w:rFonts w:ascii="微软雅黑" w:hAnsi="微软雅黑" w:eastAsia="微软雅黑"/>
-          <w:sz w:val="20"/>
-        </w:rPr>
-        <w:t>6. 完善 ui_read_key：读取 W/A/S/D/P/R/Q；如果扩展方向键，需要处理 _getch 返回的特殊按键码。</w:t>
-      </w:r>
-    </w:p>
-    <w:p>
-      <w:pPr>
-        <w:spacing w:line="288" w:lineRule="auto" w:after="40"/>
-        <w:ind w:left="454" w:hanging="283"/>
-      </w:pPr>
-      <w:r>
-        <w:rPr>
-          <w:rFonts w:ascii="微软雅黑" w:hAnsi="微软雅黑" w:eastAsia="微软雅黑"/>
-          <w:sz w:val="20"/>
-        </w:rPr>
-        <w:t>7. 完善 ui_sleep：控制刷新间隔，使速度变化能体现在游戏运行中。</w:t>
-      </w:r>
-    </w:p>
-    <w:p>
-      <w:pPr>
-        <w:pStyle w:val="Heading2"/>
-        <w:spacing w:before="100" w:after="100"/>
-      </w:pPr>
-      <w:r>
-        <w:rPr>
-          <w:rFonts w:ascii="微软雅黑" w:hAnsi="微软雅黑" w:eastAsia="微软雅黑"/>
-          <w:b/>
-          <w:color w:val="374151"/>
-          <w:sz w:val="25"/>
-        </w:rPr>
-        <w:t>自测重点</w:t>
-      </w:r>
-    </w:p>
-    <w:p>
-      <w:pPr>
-        <w:spacing w:line="288" w:lineRule="auto" w:after="40"/>
-        <w:ind w:left="369" w:hanging="198"/>
-      </w:pPr>
-      <w:r>
-        <w:rPr>
-          <w:rFonts w:ascii="微软雅黑" w:hAnsi="微软雅黑" w:eastAsia="微软雅黑"/>
-          <w:sz w:val="21"/>
-        </w:rPr>
-        <w:t>• 地图边框完整，蛇和食物显示位置正确。</w:t>
-      </w:r>
-    </w:p>
-    <w:p>
-      <w:pPr>
-        <w:spacing w:line="288" w:lineRule="auto" w:after="40"/>
-        <w:ind w:left="369" w:hanging="198"/>
-      </w:pPr>
-      <w:r>
-        <w:rPr>
-          <w:rFonts w:ascii="微软雅黑" w:hAnsi="微软雅黑" w:eastAsia="微软雅黑"/>
-          <w:sz w:val="21"/>
-        </w:rPr>
-        <w:t>• 分数、等级、速度信息能实时显示。</w:t>
-      </w:r>
-    </w:p>
-    <w:p>
-      <w:pPr>
-        <w:spacing w:line="288" w:lineRule="auto" w:after="40"/>
-        <w:ind w:left="369" w:hanging="198"/>
-      </w:pPr>
-      <w:r>
-        <w:rPr>
-          <w:rFonts w:ascii="微软雅黑" w:hAnsi="微软雅黑" w:eastAsia="微软雅黑"/>
-          <w:sz w:val="21"/>
-        </w:rPr>
-        <w:t>• W/A/S/D/P/R/Q 按键都能被读取并产生效果。</w:t>
-      </w:r>
-    </w:p>
-    <w:p>
-      <w:pPr>
-        <w:spacing w:line="288" w:lineRule="auto" w:after="40"/>
-        <w:ind w:left="369" w:hanging="198"/>
-      </w:pPr>
-      <w:r>
-        <w:rPr>
-          <w:rFonts w:ascii="微软雅黑" w:hAnsi="微软雅黑" w:eastAsia="微软雅黑"/>
-          <w:sz w:val="21"/>
-        </w:rPr>
-        <w:t>• 暂停、失败、胜利提示能正常显示。</w:t>
-      </w:r>
-    </w:p>
-    <w:p>
-      <w:pPr>
-        <w:spacing w:line="288" w:lineRule="auto" w:after="40"/>
-        <w:ind w:left="369" w:hanging="198"/>
-      </w:pPr>
-      <w:r>
-        <w:rPr>
-          <w:rFonts w:ascii="微软雅黑" w:hAnsi="微软雅黑" w:eastAsia="微软雅黑"/>
-          <w:sz w:val="21"/>
-        </w:rPr>
-        <w:t>• 界面刷新时没有严重乱码或残影。</w:t>
-      </w:r>
-    </w:p>
-    <w:p>
-      <w:pPr>
-        <w:pStyle w:val="Heading2"/>
-        <w:spacing w:before="100" w:after="100"/>
-      </w:pPr>
-      <w:r>
-        <w:rPr>
-          <w:rFonts w:ascii="微软雅黑" w:hAnsi="微软雅黑" w:eastAsia="微软雅黑"/>
-          <w:b/>
-          <w:color w:val="374151"/>
-          <w:sz w:val="25"/>
-        </w:rPr>
-        <w:t>建议提交命令</w:t>
-      </w:r>
-    </w:p>
-    <w:tbl>
-      <w:tblPr>
-        <w:tblStyle w:val="TableGrid"/>
-        <w:tblW w:type="auto" w:w="0"/>
-        <w:jc w:val="center"/>
-        <w:tblLook w:firstColumn="1" w:firstRow="1" w:lastColumn="0" w:lastRow="0" w:noHBand="0" w:noVBand="1" w:val="04A0"/>
-      </w:tblPr>
-      <w:tblGrid>
-        <w:gridCol w:w="9858"/>
-      </w:tblGrid>
-      <w:tr>
-        <w:tc>
-          <w:tcPr>
-            <w:tcW w:type="dxa" w:w="9858"/>
-            <w:shd w:fill="F3F4F6"/>
-            <w:vAlign w:val="center"/>
-          </w:tcPr>
-          <w:p>
-            <w:pPr>
-              <w:spacing w:before="40" w:after="40"/>
-            </w:pPr>
-            <w:r>
-              <w:rPr>
-                <w:rFonts w:ascii="Consolas" w:hAnsi="Consolas" w:eastAsia="Consolas"/>
-                <w:color w:val="111827"/>
-                <w:sz w:val="18"/>
-              </w:rPr>
-              <w:t>git add src\ui.c src\ui.h</w:t>
-            </w:r>
-            <w:r>
-              <w:br/>
-            </w:r>
-            <w:r>
-              <w:rPr>
-                <w:rFonts w:ascii="Consolas" w:hAnsi="Consolas" w:eastAsia="Consolas"/>
-                <w:color w:val="111827"/>
-                <w:sz w:val="18"/>
-              </w:rPr>
-              <w:t>git commit -m "完成界面绘制和键盘交互模块"</w:t>
-            </w:r>
-            <w:r>
-              <w:br/>
-            </w:r>
-            <w:r>
-              <w:rPr>
-                <w:rFonts w:ascii="Consolas" w:hAnsi="Consolas" w:eastAsia="Consolas"/>
-                <w:color w:val="111827"/>
-                <w:sz w:val="18"/>
-              </w:rPr>
-              <w:t>git push origin main</w:t>
-            </w:r>
-          </w:p>
-        </w:tc>
-      </w:tr>
-    </w:tbl>
-    <w:p/>
-    <w:p>
-      <w:r>
-        <w:br w:type="page"/>
-      </w:r>
-    </w:p>
-    <w:p>
-      <w:pPr>
-        <w:pStyle w:val="Heading1"/>
-        <w:spacing w:before="160" w:after="100"/>
-      </w:pPr>
-      <w:r>
-        <w:rPr>
-          <w:rFonts w:ascii="微软雅黑" w:hAnsi="微软雅黑" w:eastAsia="微软雅黑"/>
-          <w:b/>
-          <w:color w:val="0F766E"/>
-          <w:sz w:val="32"/>
-        </w:rPr>
-        <w:t>七、推荐联调顺序</w:t>
-      </w:r>
-    </w:p>
-    <w:p>
-      <w:pPr>
-        <w:spacing w:line="288" w:lineRule="auto" w:after="40"/>
-        <w:ind w:left="454" w:hanging="283"/>
-      </w:pPr>
-      <w:r>
-        <w:rPr>
-          <w:rFonts w:ascii="微软雅黑" w:hAnsi="微软雅黑" w:eastAsia="微软雅黑"/>
-          <w:sz w:val="20"/>
-        </w:rPr>
-        <w:t>1. 成员2先提交蛇身初始化、方向控制和基础移动，让游戏有可移动对象。</w:t>
-      </w:r>
-    </w:p>
-    <w:p>
-      <w:pPr>
-        <w:spacing w:line="288" w:lineRule="auto" w:after="40"/>
-        <w:ind w:left="454" w:hanging="283"/>
-      </w:pPr>
-      <w:r>
-        <w:rPr>
-          <w:rFonts w:ascii="微软雅黑" w:hAnsi="微软雅黑" w:eastAsia="微软雅黑"/>
-          <w:sz w:val="20"/>
-        </w:rPr>
-        <w:t>2. 成员3提交食物生成和计分逻辑，让蛇吃食物后能产生变化。</w:t>
-      </w:r>
-    </w:p>
-    <w:p>
-      <w:pPr>
-        <w:spacing w:line="288" w:lineRule="auto" w:after="40"/>
-        <w:ind w:left="454" w:hanging="283"/>
-      </w:pPr>
-      <w:r>
-        <w:rPr>
-          <w:rFonts w:ascii="微软雅黑" w:hAnsi="微软雅黑" w:eastAsia="微软雅黑"/>
-          <w:sz w:val="20"/>
-        </w:rPr>
-        <w:t>3. 成员4提交碰撞检测，让游戏具备失败和胜利判断。</w:t>
-      </w:r>
-    </w:p>
-    <w:p>
-      <w:pPr>
-        <w:spacing w:line="288" w:lineRule="auto" w:after="40"/>
-        <w:ind w:left="454" w:hanging="283"/>
-      </w:pPr>
-      <w:r>
-        <w:rPr>
-          <w:rFonts w:ascii="微软雅黑" w:hAnsi="微软雅黑" w:eastAsia="微软雅黑"/>
-          <w:sz w:val="20"/>
-        </w:rPr>
-        <w:t>4. 成员5提交界面绘制和键盘读取，让游戏显示更完整。</w:t>
-      </w:r>
-    </w:p>
-    <w:p>
-      <w:pPr>
-        <w:spacing w:line="288" w:lineRule="auto" w:after="40"/>
-        <w:ind w:left="454" w:hanging="283"/>
-      </w:pPr>
-      <w:r>
-        <w:rPr>
-          <w:rFonts w:ascii="微软雅黑" w:hAnsi="微软雅黑" w:eastAsia="微软雅黑"/>
-          <w:sz w:val="20"/>
-        </w:rPr>
-        <w:t>5. 成员1最后进行整体联调，检查模块调用顺序、状态切换和异常情况。</w:t>
-      </w:r>
-    </w:p>
-    <w:p>
-      <w:pPr>
-        <w:pStyle w:val="Heading1"/>
-        <w:spacing w:before="160" w:after="100"/>
-      </w:pPr>
-      <w:r>
-        <w:rPr>
-          <w:rFonts w:ascii="微软雅黑" w:hAnsi="微软雅黑" w:eastAsia="微软雅黑"/>
-          <w:b/>
-          <w:color w:val="0F766E"/>
-          <w:sz w:val="32"/>
-        </w:rPr>
-        <w:t>八、最终检查清单</w:t>
-      </w:r>
-    </w:p>
-    <w:p>
-      <w:pPr>
-        <w:spacing w:line="288" w:lineRule="auto" w:after="40"/>
-        <w:ind w:left="369" w:hanging="198"/>
-      </w:pPr>
-      <w:r>
-        <w:rPr>
-          <w:rFonts w:ascii="微软雅黑" w:hAnsi="微软雅黑" w:eastAsia="微软雅黑"/>
-          <w:sz w:val="21"/>
-        </w:rPr>
-        <w:t>• 项目整体仍然使用 C 语言实现，没有引入 C++ 或 Python 核心代码。</w:t>
-      </w:r>
-    </w:p>
-    <w:p>
-      <w:pPr>
-        <w:spacing w:line="288" w:lineRule="auto" w:after="40"/>
-        <w:ind w:left="369" w:hanging="198"/>
-      </w:pPr>
-      <w:r>
-        <w:rPr>
-          <w:rFonts w:ascii="微软雅黑" w:hAnsi="微软雅黑" w:eastAsia="微软雅黑"/>
-          <w:sz w:val="21"/>
-        </w:rPr>
-        <w:t>• 每个人都有对应的 .c/.h 文件修改记录。</w:t>
-      </w:r>
-    </w:p>
-    <w:p>
-      <w:pPr>
-        <w:spacing w:line="288" w:lineRule="auto" w:after="40"/>
-        <w:ind w:left="369" w:hanging="198"/>
-      </w:pPr>
-      <w:r>
-        <w:rPr>
-          <w:rFonts w:ascii="微软雅黑" w:hAnsi="微软雅黑" w:eastAsia="微软雅黑"/>
-          <w:sz w:val="21"/>
-        </w:rPr>
-        <w:t>• 所有模块合并后能通过 GCC 编译。</w:t>
-      </w:r>
-    </w:p>
-    <w:p>
-      <w:pPr>
-        <w:spacing w:line="288" w:lineRule="auto" w:after="40"/>
-        <w:ind w:left="369" w:hanging="198"/>
-      </w:pPr>
-      <w:r>
-        <w:rPr>
-          <w:rFonts w:ascii="微软雅黑" w:hAnsi="微软雅黑" w:eastAsia="微软雅黑"/>
-          <w:sz w:val="21"/>
-        </w:rPr>
-        <w:t>• 游戏能启动、移动、吃食物、加分、失败、重开和退出。</w:t>
-      </w:r>
-    </w:p>
-    <w:p>
-      <w:pPr>
-        <w:spacing w:line="288" w:lineRule="auto" w:after="40"/>
-        <w:ind w:left="369" w:hanging="198"/>
-      </w:pPr>
-      <w:r>
-        <w:rPr>
-          <w:rFonts w:ascii="微软雅黑" w:hAnsi="微软雅黑" w:eastAsia="微软雅黑"/>
-          <w:sz w:val="21"/>
-        </w:rPr>
-        <w:t>• README、TASKS 或报告中的分工与实际代码文件一致。</w:t>
-      </w:r>
-    </w:p>
-    <w:p>
-      <w:pPr>
-        <w:spacing w:line="288" w:lineRule="auto" w:after="40"/>
-        <w:ind w:left="369" w:hanging="198"/>
-      </w:pPr>
-      <w:r>
-        <w:rPr>
-          <w:rFonts w:ascii="微软雅黑" w:hAnsi="微软雅黑" w:eastAsia="微软雅黑"/>
-          <w:sz w:val="21"/>
-        </w:rPr>
-        <w:t>• 最终答辩或报告中，每个人能说明自己模块的核心函数和实现思路。</w:t>
-      </w:r>
-    </w:p>
-    <w:p>
-      <w:pPr>
-        <w:sectPr>
-          <w:footerReference w:type="default" r:id="rId9"/>
-          <w:pgSz w:w="12240" w:h="15840"/>
-          <w:pgMar w:top="1247" w:right="1191" w:bottom="1134" w:left="1191" w:header="720" w:footer="720" w:gutter="0"/>
-          <w:cols w:space="720"/>
-          <w:docGrid w:linePitch="360"/>
-        </w:sectPr>
-      </w:pPr>
-    </w:p>
     <w:sectPr>
-      <w:type w:val="continuous"/>
       <w:pgSz w:w="12240" w:h="15840"/>
-      <w:pgMar w:top="1247" w:right="1191" w:bottom="1134" w:left="1191" w:header="720" w:footer="720" w:gutter="0"/>
+      <w:pgMar w:top="1134" w:right="1134" w:bottom="1134" w:left="1134" w:header="720" w:footer="720" w:gutter="0"/>
       <w:cols w:space="720"/>
       <w:docGrid w:linePitch="360"/>
     </w:sectPr>
   </w:body>
 </w:document>
-</file>
-
-<file path=word/footer1.xml><?xml version="1.0" encoding="utf-8"?>
-<w:ftr xmlns:m="http://schemas.openxmlformats.org/officeDocument/2006/math" xmlns:mc="http://schemas.openxmlformats.org/markup-compatibility/2006" xmlns:mo="http://schemas.microsoft.com/office/mac/office/2008/main" xmlns:mv="urn:schemas-microsoft-com:mac:vml" xmlns:o="urn:schemas-microsoft-com:office:office" xmlns:r="http://schemas.openxmlformats.org/officeDocument/2006/relationships" xmlns:v="urn:schemas-microsoft-com:vml" xmlns:w10="urn:schemas-microsoft-com:office:word" xmlns:w14="http://schemas.microsoft.com/office/word/2010/wordml" xmlns:w="http://schemas.openxmlformats.org/wordprocessingml/2006/main" xmlns:wne="http://schemas.microsoft.com/office/word/2006/wordml" xmlns:wp14="http://schemas.microsoft.com/office/word/2010/wordprocessingDrawing" xmlns:wp="http://schemas.openxmlformats.org/drawingml/2006/wordprocessingDrawing" xmlns:wpc="http://schemas.microsoft.com/office/word/2010/wordprocessingCanvas" xmlns:wpg="http://schemas.microsoft.com/office/word/2010/wordprocessingGroup" xmlns:wpi="http://schemas.microsoft.com/office/word/2010/wordprocessingInk" xmlns:wps="http://schemas.microsoft.com/office/word/2010/wordprocessingShape" mc:Ignorable="w14 wp14">
-  <w:p>
-    <w:pPr>
-      <w:pStyle w:val="Footer"/>
-      <w:jc w:val="center"/>
-    </w:pPr>
-    <w:r>
-      <w:rPr>
-        <w:rFonts w:ascii="微软雅黑" w:hAnsi="微软雅黑" w:eastAsia="微软雅黑"/>
-        <w:color w:val="6B7280"/>
-        <w:sz w:val="18"/>
-      </w:rPr>
-      <w:t>贪吃蛇项目五人详细工作步骤安排</w:t>
-    </w:r>
-  </w:p>
-</w:ftr>
 </file>
 
 <file path=word/numbering.xml><?xml version="1.0" encoding="utf-8"?>
@@ -3975,10 +2371,6 @@
     <w:name w:val="Normal"/>
     <w:qFormat/>
     <w:rsid w:val="00FC693F"/>
-    <w:rPr>
-      <w:rFonts w:ascii="微软雅黑" w:hAnsi="微软雅黑" w:eastAsia="微软雅黑"/>
-      <w:sz w:val="21"/>
-    </w:rPr>
   </w:style>
   <w:style w:type="paragraph" w:styleId="Header">
     <w:name w:val="header"/>

</xml_diff>

<commit_message>
Modularize raylib snake game and add menu polish
</commit_message>
<xml_diff>
--- a/docs/贪吃蛇项目五人详细工作步骤安排.docx
+++ b/docs/贪吃蛇项目五人详细工作步骤安排.docx
@@ -57,7 +57,7 @@
           <w:color w:val="111827"/>
           <w:sz w:val="21"/>
         </w:rPr>
-        <w:t>本项目已经从控制台字符版调整为 C11 + raylib 图形化单机贪吃蛇。核心代码集中在 src/main.c，配套 build.bat、CMakeLists.txt 和 README.md。</w:t>
+        <w:t>本项目已经从控制台字符版调整为 C11 + raylib 图形化单机贪吃蛇。当前代码拆分为 main、game、snake、food、ui 五个模块，配套 build.bat、CMakeLists.txt 和 README.md。</w:t>
       </w:r>
     </w:p>
     <w:tbl>
@@ -354,7 +354,7 @@
           <w:color w:val="111827"/>
           <w:sz w:val="21"/>
         </w:rPr>
-        <w:t>每次写代码前先同步，写完后先编译，再提交。由于 src/main.c 是单文件实现，成员之间要按函数区域协作。</w:t>
+        <w:t>每次写代码前先同步，写完后先编译，再提交。当前代码已经拆分为 main、game、snake、food、ui 五个模块，成员之间按文件协作。</w:t>
       </w:r>
     </w:p>
     <w:tbl>
@@ -408,7 +408,7 @@
                 <w:color w:val="111827"/>
                 <w:sz w:val="18"/>
               </w:rPr>
-              <w:t>git diff src\main.c</w:t>
+              <w:t>git diff</w:t>
             </w:r>
             <w:r>
               <w:br/>
@@ -420,7 +420,7 @@
                 <w:color w:val="111827"/>
                 <w:sz w:val="18"/>
               </w:rPr>
-              <w:t>git add src\main.c</w:t>
+              <w:t>git add src\自己负责的文件.c src\自己负责的文件.h</w:t>
             </w:r>
             <w:r>
               <w:br/>
@@ -601,7 +601,7 @@
                 <w:color w:val="111827"/>
                 <w:sz w:val="18"/>
               </w:rPr>
-              <w:t>main, InitGame, ResetGame, StartOrResumeGame, TogglePause, UpdateGame</w:t>
+              <w:t>src/main.c, src/game.c, src/game.h</w:t>
             </w:r>
           </w:p>
         </w:tc>
@@ -887,7 +887,7 @@
                 <w:color w:val="111827"/>
                 <w:sz w:val="18"/>
               </w:rPr>
-              <w:t>Snake, QueueDirection, MoveSnake, NextHead, SameCell, SnakeContains</w:t>
+              <w:t>src/snake.c, src/snake.h</w:t>
             </w:r>
           </w:p>
         </w:tc>
@@ -1173,7 +1173,7 @@
                 <w:color w:val="111827"/>
                 <w:sz w:val="18"/>
               </w:rPr>
-              <w:t>Food, SpawnFood, DrawFood, UpdateDifficulty, LoadHighScore, SaveHighScore</w:t>
+              <w:t>src/food.c, src/food.h</w:t>
             </w:r>
           </w:p>
         </w:tc>
@@ -1473,7 +1473,7 @@
                 <w:color w:val="111827"/>
                 <w:sz w:val="18"/>
               </w:rPr>
-              <w:t>DrawBackground, DrawHeader, DrawBoardFrame, DrawBoardGrid, DrawSnake, DrawSnakeEyes</w:t>
+              <w:t>src/ui.c, src/ui.h 中的绘制函数</w:t>
             </w:r>
           </w:p>
         </w:tc>
@@ -1759,7 +1759,7 @@
                 <w:color w:val="111827"/>
                 <w:sz w:val="18"/>
               </w:rPr>
-              <w:t>HandleButtons, ActivateButton, DrawSidePanel, DrawButton, DrawOverlay, DrawTextFit, ButtonLabel, build.bat, CMakeLists.txt</w:t>
+              <w:t>build.bat, CMakeLists.txt, README.md, TASKS.md, CONTRIBUTING.md，并配合维护 src/ui.c 的按钮区域</w:t>
             </w:r>
           </w:p>
         </w:tc>

</xml_diff>

<commit_message>
Split code packages by team member
</commit_message>
<xml_diff>
--- a/docs/贪吃蛇项目五人详细工作步骤安排.docx
+++ b/docs/贪吃蛇项目五人详细工作步骤安排.docx
@@ -57,7 +57,7 @@
           <w:color w:val="111827"/>
           <w:sz w:val="21"/>
         </w:rPr>
-        <w:t>本项目已经从控制台字符版调整为 C11 + raylib 图形化单机贪吃蛇。当前代码拆分为 main、game、snake、food、ui 五个模块，配套 build.bat、CMakeLists.txt 和 README.md。</w:t>
+        <w:t>本项目已经从控制台字符版调整为 C11 + raylib 图形化单机贪吃蛇。当前代码拆分为 main、game、snake、food、ui、controls 等模块，配套 build.bat、CMakeLists.txt 和 README.md。</w:t>
       </w:r>
     </w:p>
     <w:tbl>
@@ -354,7 +354,7 @@
           <w:color w:val="111827"/>
           <w:sz w:val="21"/>
         </w:rPr>
-        <w:t>每次写代码前先同步，写完后先编译，再提交。当前代码已经拆分为 main、game、snake、food、ui 五个模块，成员之间按文件协作。</w:t>
+        <w:t>每次写代码前先同步，写完后先编译，再提交。当前代码已经拆分为 main、game、snake、food、ui、controls 等模块，成员之间按文件协作。</w:t>
       </w:r>
     </w:p>
     <w:tbl>
@@ -1759,7 +1759,7 @@
                 <w:color w:val="111827"/>
                 <w:sz w:val="18"/>
               </w:rPr>
-              <w:t>build.bat, CMakeLists.txt, README.md, TASKS.md, CONTRIBUTING.md，并配合维护 src/ui.c 的按钮区域</w:t>
+              <w:t>src/controls.c, src/controls.h, build.bat, CMakeLists.txt, README.md, TASKS.md, CONTRIBUTING.md</w:t>
             </w:r>
           </w:p>
         </w:tc>

</xml_diff>